<commit_message>
Fully translated Errata list for piece 7.
</commit_message>
<xml_diff>
--- a/Working Folder/7 Gordon Fung 冯迪伦 - Arise, You Lion of Glory! 狮舞弄清韻/V1/7 Gordon Fung 冯迪伦 - Arise, You Lion of Glory! 狮舞弄清韻 - Errata_v1.docx
+++ b/Working Folder/7 Gordon Fung 冯迪伦 - Arise, You Lion of Glory! 狮舞弄清韻/V1/7 Gordon Fung 冯迪伦 - Arise, You Lion of Glory! 狮舞弄清韻 - Errata_v1.docx
@@ -6,14 +6,14 @@
       <w:pPr>
         <w:jc w:val="center"/>
         <w:rPr>
-          <w:rFonts w:ascii="Times" w:eastAsia="Times" w:hAnsi="Times" w:cs="Times"/>
+          <w:rFonts w:ascii="Times" w:hAnsi="Times" w:cs="Times"/>
           <w:sz w:val="40"/>
           <w:szCs w:val="40"/>
         </w:rPr>
       </w:pPr>
       <w:r>
         <w:rPr>
-          <w:rFonts w:ascii="Times" w:eastAsia="Times" w:hAnsi="Times" w:cs="Times" w:hint="eastAsia"/>
+          <w:rFonts w:ascii="Times" w:hAnsi="Times" w:cs="Times" w:hint="eastAsia"/>
           <w:sz w:val="40"/>
           <w:szCs w:val="40"/>
         </w:rPr>
@@ -21,7 +21,7 @@
       </w:r>
       <w:r>
         <w:rPr>
-          <w:rFonts w:ascii="PingFang TC" w:eastAsia="PingFang TC" w:hAnsi="PingFang TC" w:cs="PingFang TC" w:hint="eastAsia"/>
+          <w:rFonts w:ascii="PingFang TC" w:hAnsi="PingFang TC" w:cs="PingFang TC" w:hint="eastAsia"/>
           <w:sz w:val="40"/>
           <w:szCs w:val="40"/>
         </w:rPr>
@@ -29,7 +29,7 @@
       </w:r>
       <w:r>
         <w:rPr>
-          <w:rFonts w:ascii="MS Mincho" w:eastAsia="MS Mincho" w:hAnsi="MS Mincho" w:cs="MS Mincho" w:hint="eastAsia"/>
+          <w:rFonts w:ascii="MS Mincho" w:hAnsi="MS Mincho" w:cs="MS Mincho" w:hint="eastAsia"/>
           <w:sz w:val="40"/>
           <w:szCs w:val="40"/>
         </w:rPr>
@@ -37,7 +37,7 @@
       </w:r>
       <w:r>
         <w:rPr>
-          <w:rFonts w:ascii="PingFang TC" w:eastAsia="PingFang TC" w:hAnsi="PingFang TC" w:cs="PingFang TC" w:hint="eastAsia"/>
+          <w:rFonts w:ascii="PingFang TC" w:hAnsi="PingFang TC" w:cs="PingFang TC" w:hint="eastAsia"/>
           <w:sz w:val="40"/>
           <w:szCs w:val="40"/>
         </w:rPr>
@@ -45,7 +45,7 @@
       </w:r>
       <w:r>
         <w:rPr>
-          <w:rFonts w:ascii="Times" w:eastAsia="Times" w:hAnsi="Times" w:cs="Times" w:hint="eastAsia"/>
+          <w:rFonts w:ascii="Times" w:hAnsi="Times" w:cs="Times" w:hint="eastAsia"/>
           <w:sz w:val="40"/>
           <w:szCs w:val="40"/>
         </w:rPr>
@@ -56,14 +56,14 @@
       <w:pPr>
         <w:jc w:val="center"/>
         <w:rPr>
-          <w:rFonts w:ascii="MS Mincho" w:eastAsia="MS Mincho" w:hAnsi="MS Mincho" w:cs="MS Mincho"/>
+          <w:rFonts w:ascii="MS Mincho" w:hAnsi="MS Mincho" w:cs="MS Mincho"/>
           <w:sz w:val="40"/>
           <w:szCs w:val="40"/>
         </w:rPr>
       </w:pPr>
       <w:r>
         <w:rPr>
-          <w:rFonts w:ascii="Times" w:eastAsia="Times" w:hAnsi="Times" w:cs="Times" w:hint="eastAsia"/>
+          <w:rFonts w:ascii="Times" w:hAnsi="Times" w:cs="Times" w:hint="eastAsia"/>
           <w:sz w:val="40"/>
           <w:szCs w:val="40"/>
         </w:rPr>
@@ -71,7 +71,7 @@
       </w:r>
       <w:r>
         <w:rPr>
-          <w:rFonts w:ascii="PingFang TC" w:eastAsia="PingFang TC" w:hAnsi="PingFang TC" w:cs="PingFang TC" w:hint="eastAsia"/>
+          <w:rFonts w:ascii="PingFang TC" w:hAnsi="PingFang TC" w:cs="PingFang TC" w:hint="eastAsia"/>
           <w:sz w:val="40"/>
           <w:szCs w:val="40"/>
         </w:rPr>
@@ -79,7 +79,7 @@
       </w:r>
       <w:r>
         <w:rPr>
-          <w:rFonts w:ascii="MS Mincho" w:eastAsia="MS Mincho" w:hAnsi="MS Mincho" w:cs="MS Mincho" w:hint="eastAsia"/>
+          <w:rFonts w:ascii="MS Mincho" w:hAnsi="MS Mincho" w:cs="MS Mincho" w:hint="eastAsia"/>
           <w:sz w:val="40"/>
           <w:szCs w:val="40"/>
         </w:rPr>
@@ -90,7 +90,7 @@
       <w:pPr>
         <w:jc w:val="center"/>
         <w:rPr>
-          <w:rFonts w:ascii="Times" w:eastAsia="Times" w:hAnsi="Times" w:cs="Times"/>
+          <w:rFonts w:ascii="Times" w:hAnsi="Times" w:cs="Times"/>
           <w:b/>
           <w:sz w:val="32"/>
           <w:szCs w:val="32"/>
@@ -98,7 +98,7 @@
       </w:pPr>
       <w:r>
         <w:rPr>
-          <w:rFonts w:ascii="Times" w:eastAsia="Times" w:hAnsi="Times" w:cs="Times"/>
+          <w:rFonts w:ascii="Times" w:hAnsi="Times" w:cs="Times"/>
           <w:b/>
           <w:sz w:val="32"/>
           <w:szCs w:val="32"/>
@@ -109,7 +109,7 @@
     <w:p>
       <w:pPr>
         <w:rPr>
-          <w:rFonts w:ascii="Times" w:eastAsia="Times" w:hAnsi="Times" w:cs="Times"/>
+          <w:rFonts w:ascii="Times" w:hAnsi="Times" w:cs="Times"/>
           <w:bCs/>
           <w:sz w:val="32"/>
           <w:szCs w:val="32"/>
@@ -129,7 +129,7 @@
       </w:pPr>
       <w:r>
         <w:rPr>
-          <w:rFonts w:ascii="Times" w:eastAsia="Times" w:hAnsi="Times" w:cs="Times"/>
+          <w:rFonts w:ascii="Times" w:hAnsi="Times" w:cs="Times"/>
           <w:bCs/>
           <w:sz w:val="32"/>
           <w:szCs w:val="32"/>
@@ -138,7 +138,7 @@
       </w:r>
       <w:r>
         <w:rPr>
-          <w:rFonts w:ascii="Times" w:eastAsia="Times" w:hAnsi="Times" w:cs="Times"/>
+          <w:rFonts w:ascii="Times" w:hAnsi="Times" w:cs="Times"/>
           <w:bCs/>
           <w:sz w:val="32"/>
           <w:szCs w:val="32"/>
@@ -147,7 +147,7 @@
       </w:r>
       <w:r>
         <w:rPr>
-          <w:rFonts w:ascii="Times" w:eastAsia="Times" w:hAnsi="Times" w:cs="Times"/>
+          <w:rFonts w:ascii="Times" w:hAnsi="Times" w:cs="Times"/>
           <w:bCs/>
           <w:sz w:val="32"/>
           <w:szCs w:val="32"/>
@@ -156,7 +156,7 @@
       </w:r>
       <w:r>
         <w:rPr>
-          <w:rFonts w:ascii="Times" w:eastAsia="Times" w:hAnsi="Times" w:cs="Times"/>
+          <w:rFonts w:ascii="Times" w:hAnsi="Times" w:cs="Times"/>
           <w:bCs/>
           <w:sz w:val="32"/>
           <w:szCs w:val="32"/>
@@ -165,7 +165,7 @@
       </w:r>
       <w:r>
         <w:rPr>
-          <w:rFonts w:ascii="Times" w:eastAsia="Times" w:hAnsi="Times" w:cs="Times"/>
+          <w:rFonts w:ascii="Times" w:hAnsi="Times" w:cs="Times"/>
           <w:bCs/>
           <w:color w:val="FF40FF"/>
           <w:sz w:val="32"/>
@@ -175,7 +175,7 @@
       </w:r>
       <w:r>
         <w:rPr>
-          <w:rFonts w:ascii="Times" w:eastAsia="Times" w:hAnsi="Times" w:cs="Times"/>
+          <w:rFonts w:ascii="Times" w:hAnsi="Times" w:cs="Times"/>
           <w:bCs/>
           <w:sz w:val="32"/>
           <w:szCs w:val="32"/>
@@ -228,7 +228,7 @@
         <w:ind w:left="720"/>
         <w:jc w:val="both"/>
         <w:rPr>
-          <w:rFonts w:ascii="Times" w:eastAsia="Times" w:hAnsi="Times" w:cs="Times"/>
+          <w:rFonts w:ascii="Times" w:hAnsi="Times" w:cs="Times"/>
           <w:bCs/>
           <w:sz w:val="32"/>
           <w:szCs w:val="32"/>
@@ -236,7 +236,7 @@
       </w:pPr>
       <w:r>
         <w:rPr>
-          <w:rFonts w:ascii="Times" w:eastAsia="Times" w:hAnsi="Times" w:cs="Times"/>
+          <w:rFonts w:ascii="Times" w:hAnsi="Times" w:cs="Times"/>
           <w:bCs/>
           <w:sz w:val="32"/>
           <w:szCs w:val="32"/>
@@ -254,7 +254,7 @@
       </w:r>
       <w:r>
         <w:rPr>
-          <w:rFonts w:ascii="Times" w:eastAsia="Times" w:hAnsi="Times" w:cs="Times"/>
+          <w:rFonts w:ascii="Times" w:hAnsi="Times" w:cs="Times"/>
           <w:bCs/>
           <w:sz w:val="32"/>
           <w:szCs w:val="32"/>
@@ -271,33 +271,53 @@
         </w:numPr>
         <w:jc w:val="both"/>
         <w:rPr>
-          <w:rFonts w:ascii="Times New Roman" w:eastAsia="Times" w:hAnsi="Times New Roman" w:cs="Times New Roman"/>
-          <w:bCs/>
-          <w:sz w:val="32"/>
-          <w:szCs w:val="32"/>
-        </w:rPr>
-      </w:pPr>
-      <w:r>
-        <w:rPr>
-          <w:rFonts w:ascii="Times New Roman" w:eastAsia="Times" w:hAnsi="Times New Roman" w:cs="Times New Roman"/>
-          <w:bCs/>
-          <w:sz w:val="32"/>
-          <w:szCs w:val="32"/>
-        </w:rPr>
-        <w:t xml:space="preserve">Font and format changes, including use of small time signatures, as agreed by SCO. </w:t>
-      </w:r>
-      <w:r>
-        <w:rPr>
           <w:rFonts w:ascii="Times New Roman" w:hAnsi="Times New Roman" w:cs="Times New Roman"/>
           <w:bCs/>
           <w:sz w:val="32"/>
           <w:szCs w:val="32"/>
         </w:rPr>
+      </w:pPr>
+      <w:r>
+        <w:rPr>
+          <w:rFonts w:ascii="Times New Roman" w:hAnsi="Times New Roman" w:cs="Times New Roman"/>
+          <w:bCs/>
+          <w:sz w:val="32"/>
+          <w:szCs w:val="32"/>
+        </w:rPr>
+        <w:t xml:space="preserve">Font and format changes, including use of </w:t>
+      </w:r>
+      <w:proofErr w:type="gramStart"/>
+      <w:r>
+        <w:rPr>
+          <w:rFonts w:ascii="Times New Roman" w:hAnsi="Times New Roman" w:cs="Times New Roman"/>
+          <w:bCs/>
+          <w:sz w:val="32"/>
+          <w:szCs w:val="32"/>
+        </w:rPr>
+        <w:t>small time</w:t>
+      </w:r>
+      <w:proofErr w:type="gramEnd"/>
+      <w:r>
+        <w:rPr>
+          <w:rFonts w:ascii="Times New Roman" w:hAnsi="Times New Roman" w:cs="Times New Roman"/>
+          <w:bCs/>
+          <w:sz w:val="32"/>
+          <w:szCs w:val="32"/>
+        </w:rPr>
+        <w:t xml:space="preserve"> signatures, as agreed by SCO. </w:t>
+      </w:r>
+      <w:r>
+        <w:rPr>
+          <w:rFonts w:ascii="Times New Roman" w:hAnsi="Times New Roman" w:cs="Times New Roman"/>
+          <w:bCs/>
+          <w:sz w:val="32"/>
+          <w:szCs w:val="32"/>
+        </w:rPr>
         <w:t>字体和格式的改变，包括使用小拍号，经</w:t>
       </w:r>
       <w:r>
         <w:rPr>
-          <w:rFonts w:ascii="Times New Roman" w:eastAsia="Times" w:hAnsi="Times New Roman" w:cs="Times New Roman"/>
+          <w:rFonts w:ascii="Times New Roman" w:hAnsi="Times New Roman" w:cs="Times New Roman"/>
           <w:bCs/>
           <w:sz w:val="32"/>
           <w:szCs w:val="32"/>
@@ -323,33 +343,33 @@
         </w:numPr>
         <w:jc w:val="both"/>
         <w:rPr>
-          <w:rFonts w:ascii="Times New Roman" w:eastAsia="Times" w:hAnsi="Times New Roman" w:cs="Times New Roman"/>
-          <w:bCs/>
-          <w:sz w:val="32"/>
-          <w:szCs w:val="32"/>
-        </w:rPr>
-      </w:pPr>
-      <w:r>
-        <w:rPr>
-          <w:rFonts w:ascii="Times New Roman" w:eastAsia="Times" w:hAnsi="Times New Roman" w:cs="Times New Roman"/>
-          <w:bCs/>
-          <w:sz w:val="32"/>
-          <w:szCs w:val="32"/>
-        </w:rPr>
-        <w:t xml:space="preserve">Added English names/text for instruments. </w:t>
-      </w:r>
-      <w:r>
-        <w:rPr>
           <w:rFonts w:ascii="Times New Roman" w:hAnsi="Times New Roman" w:cs="Times New Roman"/>
           <w:bCs/>
           <w:sz w:val="32"/>
           <w:szCs w:val="32"/>
         </w:rPr>
+      </w:pPr>
+      <w:r>
+        <w:rPr>
+          <w:rFonts w:ascii="Times New Roman" w:hAnsi="Times New Roman" w:cs="Times New Roman"/>
+          <w:bCs/>
+          <w:sz w:val="32"/>
+          <w:szCs w:val="32"/>
+        </w:rPr>
+        <w:t xml:space="preserve">Added English names/text for instruments. </w:t>
+      </w:r>
+      <w:r>
+        <w:rPr>
+          <w:rFonts w:ascii="Times New Roman" w:hAnsi="Times New Roman" w:cs="Times New Roman"/>
+          <w:bCs/>
+          <w:sz w:val="32"/>
+          <w:szCs w:val="32"/>
+        </w:rPr>
         <w:t>新增乐器英文名称</w:t>
       </w:r>
       <w:r>
         <w:rPr>
-          <w:rFonts w:ascii="Times New Roman" w:eastAsia="Times" w:hAnsi="Times New Roman" w:cs="Times New Roman"/>
+          <w:rFonts w:ascii="Times New Roman" w:hAnsi="Times New Roman" w:cs="Times New Roman"/>
           <w:bCs/>
           <w:sz w:val="32"/>
           <w:szCs w:val="32"/>
@@ -375,7 +395,7 @@
         </w:numPr>
         <w:jc w:val="both"/>
         <w:rPr>
-          <w:rFonts w:ascii="Times New Roman" w:eastAsia="Times" w:hAnsi="Times New Roman" w:cs="Times New Roman"/>
+          <w:rFonts w:ascii="Times New Roman" w:hAnsi="Times New Roman" w:cs="Times New Roman"/>
           <w:bCs/>
           <w:sz w:val="32"/>
           <w:szCs w:val="32"/>
@@ -383,7 +403,7 @@
       </w:pPr>
       <w:r>
         <w:rPr>
-          <w:rFonts w:ascii="Times New Roman" w:eastAsia="Times" w:hAnsi="Times New Roman" w:cs="Times New Roman"/>
+          <w:rFonts w:ascii="Times New Roman" w:hAnsi="Times New Roman" w:cs="Times New Roman"/>
           <w:bCs/>
           <w:sz w:val="32"/>
           <w:szCs w:val="32"/>
@@ -409,19 +429,19 @@
         </w:numPr>
         <w:jc w:val="both"/>
         <w:rPr>
-          <w:rFonts w:ascii="Times New Roman" w:eastAsia="Times" w:hAnsi="Times New Roman" w:cs="Times New Roman"/>
-          <w:bCs/>
-          <w:sz w:val="32"/>
-          <w:szCs w:val="32"/>
-        </w:rPr>
-      </w:pPr>
-      <w:r>
-        <w:rPr>
           <w:rFonts w:ascii="Times New Roman" w:hAnsi="Times New Roman" w:cs="Times New Roman"/>
           <w:bCs/>
           <w:sz w:val="32"/>
           <w:szCs w:val="32"/>
         </w:rPr>
+      </w:pPr>
+      <w:r>
+        <w:rPr>
+          <w:rFonts w:ascii="Times New Roman" w:hAnsi="Times New Roman" w:cs="Times New Roman"/>
+          <w:bCs/>
+          <w:sz w:val="32"/>
+          <w:szCs w:val="32"/>
+        </w:rPr>
         <w:t>Replaced divisi, tutti and unis. conventions to match with SCO guidelines.</w:t>
       </w:r>
     </w:p>
@@ -430,7 +450,7 @@
         <w:ind w:left="720"/>
         <w:jc w:val="both"/>
         <w:rPr>
-          <w:rFonts w:ascii="Times" w:eastAsia="Times" w:hAnsi="Times" w:cs="Times"/>
+          <w:rFonts w:ascii="Times" w:hAnsi="Times" w:cs="Times"/>
           <w:bCs/>
           <w:sz w:val="32"/>
           <w:szCs w:val="32"/>
@@ -438,7 +458,7 @@
       </w:pPr>
       <w:r>
         <w:rPr>
-          <w:rFonts w:ascii="Times New Roman" w:eastAsia="Times" w:hAnsi="Times New Roman" w:cs="Times New Roman"/>
+          <w:rFonts w:ascii="Times New Roman" w:hAnsi="Times New Roman" w:cs="Times New Roman"/>
           <w:bCs/>
           <w:sz w:val="32"/>
           <w:szCs w:val="32"/>
@@ -532,14 +552,14 @@
             <w:pPr>
               <w:jc w:val="center"/>
               <w:rPr>
-                <w:rFonts w:ascii="Times" w:eastAsia="Times" w:hAnsi="Times" w:cs="Times"/>
+                <w:rFonts w:ascii="Times" w:hAnsi="Times" w:cs="Times"/>
                 <w:b/>
                 <w:iCs/>
               </w:rPr>
             </w:pPr>
             <w:r>
               <w:rPr>
-                <w:rFonts w:ascii="Times" w:eastAsia="Times" w:hAnsi="Times" w:cs="Times"/>
+                <w:rFonts w:ascii="Times" w:hAnsi="Times" w:cs="Times"/>
                 <w:b/>
                 <w:iCs/>
               </w:rPr>
@@ -547,7 +567,7 @@
             </w:r>
             <w:r>
               <w:rPr>
-                <w:rFonts w:ascii="Times" w:eastAsia="Times" w:hAnsi="Times" w:cs="Times"/>
+                <w:rFonts w:ascii="Times" w:hAnsi="Times" w:cs="Times"/>
                 <w:b/>
                 <w:iCs/>
               </w:rPr>
@@ -568,13 +588,13 @@
             <w:pPr>
               <w:jc w:val="center"/>
               <w:rPr>
-                <w:rFonts w:ascii="Times" w:eastAsia="Times" w:hAnsi="Times" w:cs="Times"/>
+                <w:rFonts w:ascii="Times" w:hAnsi="Times" w:cs="Times"/>
                 <w:b/>
               </w:rPr>
             </w:pPr>
             <w:r>
               <w:rPr>
-                <w:rFonts w:ascii="Times" w:eastAsia="Times" w:hAnsi="Times" w:cs="Times"/>
+                <w:rFonts w:ascii="Times" w:hAnsi="Times" w:cs="Times"/>
                 <w:b/>
               </w:rPr>
               <w:t>Bar</w:t>
@@ -584,7 +604,7 @@
             <w:pPr>
               <w:jc w:val="center"/>
               <w:rPr>
-                <w:rFonts w:ascii="Times" w:eastAsia="Times" w:hAnsi="Times" w:cs="Times"/>
+                <w:rFonts w:ascii="Times" w:hAnsi="Times" w:cs="Times"/>
                 <w:b/>
               </w:rPr>
             </w:pPr>
@@ -605,13 +625,13 @@
             <w:pPr>
               <w:jc w:val="center"/>
               <w:rPr>
-                <w:rFonts w:ascii="Times" w:eastAsia="Times" w:hAnsi="Times" w:cs="Times"/>
+                <w:rFonts w:ascii="Times" w:hAnsi="Times" w:cs="Times"/>
                 <w:b/>
               </w:rPr>
             </w:pPr>
             <w:r>
               <w:rPr>
-                <w:rFonts w:ascii="Times" w:eastAsia="Times" w:hAnsi="Times" w:cs="Times"/>
+                <w:rFonts w:ascii="Times" w:hAnsi="Times" w:cs="Times"/>
                 <w:b/>
               </w:rPr>
               <w:t>Instrument</w:t>
@@ -621,7 +641,7 @@
             <w:pPr>
               <w:jc w:val="center"/>
               <w:rPr>
-                <w:rFonts w:ascii="Times" w:eastAsia="Times" w:hAnsi="Times" w:cs="Times"/>
+                <w:rFonts w:ascii="Times" w:hAnsi="Times" w:cs="Times"/>
                 <w:b/>
               </w:rPr>
             </w:pPr>
@@ -642,13 +662,13 @@
             <w:pPr>
               <w:jc w:val="center"/>
               <w:rPr>
-                <w:rFonts w:ascii="Times" w:eastAsia="Times" w:hAnsi="Times" w:cs="Times"/>
+                <w:rFonts w:ascii="Times" w:hAnsi="Times" w:cs="Times"/>
                 <w:b/>
               </w:rPr>
             </w:pPr>
             <w:r>
               <w:rPr>
-                <w:rFonts w:ascii="Times" w:eastAsia="Times" w:hAnsi="Times" w:cs="Times"/>
+                <w:rFonts w:ascii="Times" w:hAnsi="Times" w:cs="Times"/>
                 <w:b/>
               </w:rPr>
               <w:t>Issue</w:t>
@@ -658,7 +678,7 @@
             <w:pPr>
               <w:jc w:val="center"/>
               <w:rPr>
-                <w:rFonts w:ascii="Times" w:eastAsia="Times" w:hAnsi="Times" w:cs="Times"/>
+                <w:rFonts w:ascii="Times" w:hAnsi="Times" w:cs="Times"/>
                 <w:b/>
               </w:rPr>
             </w:pPr>
@@ -679,13 +699,13 @@
             <w:pPr>
               <w:jc w:val="center"/>
               <w:rPr>
-                <w:rFonts w:ascii="Times" w:eastAsia="Times" w:hAnsi="Times" w:cs="Times"/>
+                <w:rFonts w:ascii="Times" w:hAnsi="Times" w:cs="Times"/>
                 <w:b/>
               </w:rPr>
             </w:pPr>
             <w:r>
               <w:rPr>
-                <w:rFonts w:ascii="Times" w:eastAsia="Times" w:hAnsi="Times" w:cs="Times"/>
+                <w:rFonts w:ascii="Times" w:hAnsi="Times" w:cs="Times"/>
                 <w:b/>
               </w:rPr>
               <w:t>Answer</w:t>
@@ -695,7 +715,7 @@
             <w:pPr>
               <w:jc w:val="center"/>
               <w:rPr>
-                <w:rFonts w:ascii="Times" w:eastAsia="Times" w:hAnsi="Times" w:cs="Times"/>
+                <w:rFonts w:ascii="Times" w:hAnsi="Times" w:cs="Times"/>
                 <w:b/>
               </w:rPr>
             </w:pPr>
@@ -721,12 +741,12 @@
             <w:pPr>
               <w:jc w:val="center"/>
               <w:rPr>
-                <w:rFonts w:ascii="Times" w:eastAsia="Times" w:hAnsi="Times" w:cs="Times"/>
-              </w:rPr>
-            </w:pPr>
-            <w:r>
-              <w:rPr>
-                <w:rFonts w:ascii="Times" w:eastAsia="Times" w:hAnsi="Times" w:cs="Times"/>
+                <w:rFonts w:ascii="Times" w:hAnsi="Times" w:cs="Times"/>
+              </w:rPr>
+            </w:pPr>
+            <w:r>
+              <w:rPr>
+                <w:rFonts w:ascii="Times" w:hAnsi="Times" w:cs="Times"/>
               </w:rPr>
               <w:t>1</w:t>
             </w:r>
@@ -740,12 +760,12 @@
             <w:pPr>
               <w:jc w:val="center"/>
               <w:rPr>
-                <w:rFonts w:ascii="Times" w:eastAsia="Times" w:hAnsi="Times" w:cs="Times"/>
-              </w:rPr>
-            </w:pPr>
-            <w:r>
-              <w:rPr>
-                <w:rFonts w:ascii="Times" w:eastAsia="Times" w:hAnsi="Times" w:cs="Times"/>
+                <w:rFonts w:ascii="Times" w:hAnsi="Times" w:cs="Times"/>
+              </w:rPr>
+            </w:pPr>
+            <w:r>
+              <w:rPr>
+                <w:rFonts w:ascii="Times" w:hAnsi="Times" w:cs="Times"/>
               </w:rPr>
               <w:t>Di</w:t>
             </w:r>
@@ -758,18 +778,18 @@
           <w:p>
             <w:pPr>
               <w:rPr>
-                <w:rFonts w:ascii="Times" w:eastAsia="Times" w:hAnsi="Times" w:cs="Times"/>
-              </w:rPr>
-            </w:pPr>
-            <w:r>
-              <w:rPr>
-                <w:rFonts w:ascii="Times" w:eastAsia="Times" w:hAnsi="Times" w:cs="Times"/>
+                <w:rFonts w:ascii="Times" w:hAnsi="Times" w:cs="Times"/>
+              </w:rPr>
+            </w:pPr>
+            <w:r>
+              <w:rPr>
+                <w:rFonts w:ascii="Times" w:hAnsi="Times" w:cs="Times"/>
               </w:rPr>
               <w:t xml:space="preserve">Should these all start the crescendo at </w:t>
             </w:r>
             <w:r>
               <w:rPr>
-                <w:rFonts w:ascii="Times" w:eastAsia="Times" w:hAnsi="Times" w:cs="Times"/>
+                <w:rFonts w:ascii="Times" w:hAnsi="Times" w:cs="Times"/>
                 <w:b/>
                 <w:bCs/>
                 <w:i/>
@@ -779,7 +799,7 @@
             </w:r>
             <w:r>
               <w:rPr>
-                <w:rFonts w:ascii="Times" w:eastAsia="Times" w:hAnsi="Times" w:cs="Times"/>
+                <w:rFonts w:ascii="Times" w:hAnsi="Times" w:cs="Times"/>
               </w:rPr>
               <w:t>?</w:t>
             </w:r>
@@ -794,7 +814,7 @@
             <w:pPr>
               <w:jc w:val="center"/>
               <w:rPr>
-                <w:rFonts w:ascii="Times" w:eastAsia="Times" w:hAnsi="Times" w:cs="Times"/>
+                <w:rFonts w:ascii="Times" w:hAnsi="Times" w:cs="Times"/>
                 <w:color w:val="FF0000"/>
               </w:rPr>
             </w:pPr>
@@ -813,12 +833,12 @@
             <w:pPr>
               <w:jc w:val="center"/>
               <w:rPr>
-                <w:rFonts w:ascii="Times" w:eastAsiaTheme="minorEastAsia" w:hAnsi="Times" w:cs="Times"/>
-              </w:rPr>
-            </w:pPr>
-            <w:r>
-              <w:rPr>
-                <w:rFonts w:ascii="Times" w:eastAsiaTheme="minorEastAsia" w:hAnsi="Times" w:cs="Times" w:hint="eastAsia"/>
+                <w:rFonts w:ascii="Times" w:hAnsi="Times" w:cs="Times"/>
+              </w:rPr>
+            </w:pPr>
+            <w:r>
+              <w:rPr>
+                <w:rFonts w:ascii="Times" w:hAnsi="Times" w:cs="Times" w:hint="eastAsia"/>
               </w:rPr>
               <w:t>38</w:t>
             </w:r>
@@ -832,12 +852,12 @@
             <w:pPr>
               <w:jc w:val="center"/>
               <w:rPr>
-                <w:rFonts w:ascii="Times" w:eastAsiaTheme="minorEastAsia" w:hAnsi="Times" w:cs="Times"/>
-              </w:rPr>
-            </w:pPr>
-            <w:r>
-              <w:rPr>
-                <w:rFonts w:ascii="Times" w:eastAsiaTheme="minorEastAsia" w:hAnsi="Times" w:cs="Times" w:hint="eastAsia"/>
+                <w:rFonts w:ascii="Times" w:hAnsi="Times" w:cs="Times"/>
+              </w:rPr>
+            </w:pPr>
+            <w:r>
+              <w:rPr>
+                <w:rFonts w:ascii="Times" w:hAnsi="Times" w:cs="Times" w:hint="eastAsia"/>
               </w:rPr>
               <w:t>Perc 4</w:t>
             </w:r>
@@ -858,8 +878,17 @@
                 <w:rFonts w:ascii="Times New Roman" w:hAnsi="Times New Roman" w:cs="Times New Roman"/>
                 <w:lang w:eastAsia="zh-TW"/>
               </w:rPr>
-              <w:t>雜聲吊鈸</w:t>
-            </w:r>
+              <w:t>雜聲吊</w:t>
+            </w:r>
+            <w:proofErr w:type="gramStart"/>
+            <w:r>
+              <w:rPr>
+                <w:rFonts w:ascii="Times New Roman" w:hAnsi="Times New Roman" w:cs="Times New Roman"/>
+                <w:lang w:eastAsia="zh-TW"/>
+              </w:rPr>
+              <w:t>鈸</w:t>
+            </w:r>
+            <w:proofErr w:type="gramEnd"/>
             <w:r>
               <w:rPr>
                 <w:rFonts w:ascii="Times New Roman" w:hAnsi="Times New Roman" w:cs="Times New Roman" w:hint="eastAsia"/>
@@ -877,7 +906,7 @@
           <w:p>
             <w:pPr>
               <w:rPr>
-                <w:rFonts w:ascii="Times" w:eastAsiaTheme="minorEastAsia" w:hAnsi="Times" w:cs="Times"/>
+                <w:rFonts w:ascii="Times" w:hAnsi="Times" w:cs="Times"/>
                 <w:lang w:val="en-GB"/>
               </w:rPr>
             </w:pPr>
@@ -886,8 +915,17 @@
                 <w:rFonts w:ascii="Times New Roman" w:hAnsi="Times New Roman" w:cs="Times New Roman"/>
                 <w:lang w:eastAsia="zh-TW"/>
               </w:rPr>
-              <w:t>雜聲吊鈸</w:t>
-            </w:r>
+              <w:t>雜聲吊</w:t>
+            </w:r>
+            <w:proofErr w:type="gramStart"/>
+            <w:r>
+              <w:rPr>
+                <w:rFonts w:ascii="Times New Roman" w:hAnsi="Times New Roman" w:cs="Times New Roman"/>
+                <w:lang w:eastAsia="zh-TW"/>
+              </w:rPr>
+              <w:t>鈸</w:t>
+            </w:r>
+            <w:proofErr w:type="gramEnd"/>
             <w:r>
               <w:rPr>
                 <w:rFonts w:ascii="Times New Roman" w:hAnsi="Times New Roman" w:cs="Times New Roman"/>
@@ -913,7 +951,7 @@
             <w:pPr>
               <w:jc w:val="center"/>
               <w:rPr>
-                <w:rFonts w:ascii="Times" w:eastAsia="Times" w:hAnsi="Times" w:cs="Times"/>
+                <w:rFonts w:ascii="Times" w:hAnsi="Times" w:cs="Times"/>
                 <w:color w:val="FF0000"/>
               </w:rPr>
             </w:pPr>
@@ -932,12 +970,12 @@
             <w:pPr>
               <w:jc w:val="center"/>
               <w:rPr>
-                <w:rFonts w:ascii="Times" w:eastAsiaTheme="minorEastAsia" w:hAnsi="Times" w:cs="Times"/>
-              </w:rPr>
-            </w:pPr>
-            <w:r>
-              <w:rPr>
-                <w:rFonts w:ascii="Times" w:eastAsiaTheme="minorEastAsia" w:hAnsi="Times" w:cs="Times" w:hint="eastAsia"/>
+                <w:rFonts w:ascii="Times" w:hAnsi="Times" w:cs="Times"/>
+              </w:rPr>
+            </w:pPr>
+            <w:r>
+              <w:rPr>
+                <w:rFonts w:ascii="Times" w:hAnsi="Times" w:cs="Times" w:hint="eastAsia"/>
               </w:rPr>
               <w:t>42</w:t>
             </w:r>
@@ -951,18 +989,18 @@
             <w:pPr>
               <w:jc w:val="center"/>
               <w:rPr>
-                <w:rFonts w:ascii="Times" w:eastAsiaTheme="minorEastAsia" w:hAnsi="Times" w:cs="Times"/>
-              </w:rPr>
-            </w:pPr>
-            <w:r>
-              <w:rPr>
-                <w:rFonts w:ascii="Times" w:eastAsia="Times" w:hAnsi="Times" w:cs="Times"/>
+                <w:rFonts w:ascii="Times" w:hAnsi="Times" w:cs="Times"/>
+              </w:rPr>
+            </w:pPr>
+            <w:r>
+              <w:rPr>
+                <w:rFonts w:ascii="Times" w:hAnsi="Times" w:cs="Times"/>
               </w:rPr>
               <w:t xml:space="preserve">Perc </w:t>
             </w:r>
             <w:r>
               <w:rPr>
-                <w:rFonts w:ascii="Times" w:eastAsiaTheme="minorEastAsia" w:hAnsi="Times" w:cs="Times" w:hint="eastAsia"/>
+                <w:rFonts w:ascii="Times" w:hAnsi="Times" w:cs="Times" w:hint="eastAsia"/>
               </w:rPr>
               <w:t>5</w:t>
             </w:r>
@@ -975,36 +1013,36 @@
           <w:p>
             <w:pPr>
               <w:rPr>
-                <w:rFonts w:ascii="Times" w:eastAsiaTheme="minorEastAsia" w:hAnsi="Times" w:cs="Times"/>
-              </w:rPr>
-            </w:pPr>
-            <w:r>
-              <w:rPr>
-                <w:rFonts w:ascii="Times" w:eastAsia="Times" w:hAnsi="Times" w:cs="Times"/>
+                <w:rFonts w:ascii="Times" w:hAnsi="Times" w:cs="Times"/>
+              </w:rPr>
+            </w:pPr>
+            <w:r>
+              <w:rPr>
+                <w:rFonts w:ascii="Times" w:hAnsi="Times" w:cs="Times"/>
               </w:rPr>
               <w:t xml:space="preserve">SCO’s </w:t>
             </w:r>
             <w:r>
               <w:rPr>
-                <w:rFonts w:ascii="Times" w:eastAsiaTheme="minorEastAsia" w:hAnsi="Times" w:cs="Times" w:hint="eastAsia"/>
+                <w:rFonts w:ascii="Times" w:hAnsi="Times" w:cs="Times" w:hint="eastAsia"/>
               </w:rPr>
               <w:t xml:space="preserve">recommended </w:t>
             </w:r>
             <w:r>
               <w:rPr>
-                <w:rFonts w:ascii="Times" w:eastAsia="Times" w:hAnsi="Times" w:cs="Times"/>
+                <w:rFonts w:ascii="Times" w:hAnsi="Times" w:cs="Times"/>
               </w:rPr>
               <w:t xml:space="preserve">translation for </w:t>
             </w:r>
             <w:r>
               <w:rPr>
-                <w:rFonts w:ascii="Times" w:eastAsiaTheme="minorEastAsia" w:hAnsi="Times" w:cs="Times" w:hint="eastAsia"/>
+                <w:rFonts w:ascii="Times" w:hAnsi="Times" w:cs="Times" w:hint="eastAsia"/>
               </w:rPr>
               <w:t>V</w:t>
             </w:r>
             <w:r>
               <w:rPr>
-                <w:rFonts w:ascii="Times" w:eastAsia="Times" w:hAnsi="Times" w:cs="Times"/>
+                <w:rFonts w:ascii="Times" w:hAnsi="Times" w:cs="Times"/>
               </w:rPr>
               <w:t>ibraslap is</w:t>
             </w:r>
@@ -1016,173 +1054,126 @@
             </w:r>
             <w:r>
               <w:rPr>
-                <w:rFonts w:ascii="Times" w:eastAsia="Times" w:hAnsi="Times" w:cs="Times"/>
-              </w:rPr>
-              <w:t xml:space="preserve">, but score names </w:t>
-            </w:r>
-            <w:r>
-              <w:rPr>
-                <w:rFonts w:ascii="Times" w:eastAsia="Times" w:hAnsi="Times" w:cs="Times"/>
+                <w:rFonts w:ascii="Times" w:hAnsi="Times" w:cs="Times"/>
+              </w:rPr>
+              <w:t>, but score names them</w:t>
+            </w:r>
+            <w:r>
+              <w:rPr>
+                <w:rFonts w:ascii="SimSun" w:hAnsi="SimSun" w:cs="SimSun" w:hint="eastAsia"/>
+              </w:rPr>
+              <w:t>彈簧匣</w:t>
+            </w:r>
+            <w:r>
+              <w:rPr>
+                <w:rFonts w:ascii="Times" w:hAnsi="Times" w:cs="Times"/>
+              </w:rPr>
+              <w:t>.</w:t>
+            </w:r>
+            <w:r>
+              <w:rPr>
+                <w:rFonts w:ascii="Times" w:hAnsi="Times" w:cs="Times" w:hint="eastAsia"/>
+              </w:rPr>
+              <w:t xml:space="preserve"> Which one would you prefer?</w:t>
+            </w:r>
+          </w:p>
+          <w:p>
+            <w:pPr>
+              <w:rPr>
+                <w:rFonts w:ascii="Times" w:hAnsi="Times" w:cs="Times"/>
+              </w:rPr>
+            </w:pPr>
+          </w:p>
+          <w:p>
+            <w:pPr>
+              <w:rPr>
+                <w:rFonts w:ascii="Times New Roman" w:hAnsi="Times New Roman" w:cs="Times New Roman"/>
+                <w:lang w:eastAsia="zh-TW"/>
+              </w:rPr>
+            </w:pPr>
+            <w:r>
+              <w:rPr>
+                <w:rFonts w:ascii="Times" w:hAnsi="Times" w:cs="Times"/>
+                <w:lang w:eastAsia="zh-TW"/>
               </w:rPr>
               <w:lastRenderedPageBreak/>
-              <w:t>them</w:t>
+              <w:t xml:space="preserve">SCO </w:t>
+            </w:r>
+            <w:r>
+              <w:rPr>
+                <w:rFonts w:asciiTheme="minorEastAsia" w:hAnsiTheme="minorEastAsia" w:cs="Times" w:hint="eastAsia"/>
+                <w:lang w:eastAsia="zh-TW"/>
+              </w:rPr>
+              <w:t>“</w:t>
+            </w:r>
+            <w:r>
+              <w:rPr>
+                <w:rFonts w:ascii="Times" w:hAnsi="Times" w:cs="Times" w:hint="eastAsia"/>
+                <w:lang w:eastAsia="zh-TW"/>
+              </w:rPr>
+              <w:t>Vibraslap</w:t>
+            </w:r>
+            <w:r>
+              <w:rPr>
+                <w:rFonts w:ascii="Times" w:hAnsi="Times" w:cs="Times" w:hint="eastAsia"/>
+                <w:lang w:eastAsia="zh-TW"/>
+              </w:rPr>
+              <w:t>”</w:t>
+            </w:r>
+            <w:r>
+              <w:rPr>
+                <w:rFonts w:ascii="Times" w:hAnsi="Times" w:cs="Times" w:hint="eastAsia"/>
+                <w:lang w:eastAsia="zh-TW"/>
+              </w:rPr>
+              <w:t xml:space="preserve"> </w:t>
+            </w:r>
+            <w:r>
+              <w:rPr>
+                <w:rFonts w:ascii="SimSun" w:hAnsi="SimSun" w:cs="Times" w:hint="eastAsia"/>
+                <w:lang w:eastAsia="zh-TW"/>
+              </w:rPr>
+              <w:t>翻譯</w:t>
             </w:r>
             <w:r>
               <w:rPr>
                 <w:rFonts w:ascii="SimSun" w:hAnsi="SimSun" w:cs="SimSun" w:hint="eastAsia"/>
-              </w:rPr>
-              <w:t>彈簧匣</w:t>
-            </w:r>
-            <w:r>
-              <w:rPr>
-                <w:rFonts w:ascii="Times" w:eastAsia="Times" w:hAnsi="Times" w:cs="Times"/>
-              </w:rPr>
-              <w:t>.</w:t>
-            </w:r>
-            <w:r>
-              <w:rPr>
-                <w:rFonts w:ascii="Times" w:eastAsiaTheme="minorEastAsia" w:hAnsi="Times" w:cs="Times" w:hint="eastAsia"/>
-              </w:rPr>
-              <w:t xml:space="preserve"> Which one would you prefer?</w:t>
-            </w:r>
-          </w:p>
-          <w:p>
-            <w:pPr>
-              <w:rPr>
-                <w:rFonts w:ascii="Times" w:eastAsia="Times" w:hAnsi="Times" w:cs="Times"/>
-              </w:rPr>
-            </w:pPr>
-          </w:p>
-          <w:p>
-            <w:pPr>
-              <w:rPr>
-                <w:rFonts w:ascii="Times New Roman" w:eastAsia="Times" w:hAnsi="Times New Roman" w:cs="Times New Roman"/>
-                <w:lang w:eastAsia="zh-TW"/>
-              </w:rPr>
-            </w:pPr>
-            <w:r>
-              <w:rPr>
-                <w:rFonts w:ascii="Times" w:eastAsia="Times" w:hAnsi="Times" w:cs="Times"/>
-                <w:lang w:eastAsia="zh-TW"/>
-              </w:rPr>
-              <w:t xml:space="preserve">SCO </w:t>
-            </w:r>
-            <w:r>
-              <w:rPr>
-                <w:rFonts w:asciiTheme="minorEastAsia" w:eastAsiaTheme="minorEastAsia" w:hAnsiTheme="minorEastAsia" w:cs="Times" w:hint="eastAsia"/>
-                <w:lang w:eastAsia="zh-TW"/>
-              </w:rPr>
-              <w:t>“</w:t>
-            </w:r>
-            <w:r>
-              <w:rPr>
-                <w:rFonts w:ascii="Times" w:eastAsiaTheme="minorEastAsia" w:hAnsi="Times" w:cs="Times" w:hint="eastAsia"/>
-                <w:lang w:eastAsia="zh-TW"/>
-              </w:rPr>
-              <w:t>Vibraslap</w:t>
-            </w:r>
-            <w:r>
-              <w:rPr>
-                <w:rFonts w:ascii="Times" w:eastAsiaTheme="minorEastAsia" w:hAnsi="Times" w:cs="Times" w:hint="eastAsia"/>
-                <w:lang w:eastAsia="zh-TW"/>
-              </w:rPr>
-              <w:t>”</w:t>
-            </w:r>
-            <w:r>
-              <w:rPr>
-                <w:rFonts w:ascii="Times" w:eastAsiaTheme="minorEastAsia" w:hAnsi="Times" w:cs="Times" w:hint="eastAsia"/>
+                <w:lang w:eastAsia="zh-TW"/>
+              </w:rPr>
+              <w:t>推薦</w:t>
+            </w:r>
+            <w:r>
+              <w:rPr>
+                <w:rFonts w:ascii="SimSun" w:hAnsi="SimSun" w:cs="Times" w:hint="eastAsia"/>
+                <w:lang w:eastAsia="zh-TW"/>
+              </w:rPr>
+              <w:t>是《</w:t>
+            </w:r>
+            <w:r>
+              <w:rPr>
+                <w:rFonts w:ascii="SimSun" w:hAnsi="SimSun" w:cs="SimSun" w:hint="eastAsia"/>
+                <w:lang w:eastAsia="zh-TW"/>
+              </w:rPr>
+              <w:t>拍顫器》,</w:t>
+            </w:r>
+            <w:r>
+              <w:rPr>
+                <w:rFonts w:hint="eastAsia"/>
                 <w:lang w:eastAsia="zh-TW"/>
               </w:rPr>
               <w:t xml:space="preserve"> </w:t>
             </w:r>
             <w:r>
               <w:rPr>
-                <w:rFonts w:ascii="SimSun" w:hAnsi="SimSun" w:cs="Times" w:hint="eastAsia"/>
-                <w:lang w:eastAsia="zh-TW"/>
-              </w:rPr>
-              <w:t>翻譯</w:t>
-            </w:r>
-            <w:r>
-              <w:rPr>
                 <w:rFonts w:ascii="SimSun" w:hAnsi="SimSun" w:cs="SimSun" w:hint="eastAsia"/>
                 <w:lang w:eastAsia="zh-TW"/>
               </w:rPr>
-              <w:t>推薦</w:t>
-            </w:r>
-            <w:r>
-              <w:rPr>
-                <w:rFonts w:ascii="SimSun" w:hAnsi="SimSun" w:cs="Times" w:hint="eastAsia"/>
-                <w:lang w:eastAsia="zh-TW"/>
-              </w:rPr>
-              <w:t>是《</w:t>
+              <w:t>不過目前樂譜寫的是《彈簧匣》。</w:t>
             </w:r>
             <w:r>
               <w:rPr>
                 <w:rFonts w:ascii="SimSun" w:hAnsi="SimSun" w:cs="SimSun" w:hint="eastAsia"/>
-                <w:lang w:eastAsia="zh-TW"/>
-              </w:rPr>
-              <w:t>拍顫器》</w:t>
-            </w:r>
-            <w:r>
-              <w:rPr>
-                <w:rFonts w:ascii="SimSun" w:hAnsi="SimSun" w:cs="SimSun" w:hint="eastAsia"/>
-                <w:lang w:eastAsia="zh-TW"/>
-              </w:rPr>
-              <w:t>,</w:t>
-            </w:r>
-            <w:r>
-              <w:rPr>
-                <w:rFonts w:hint="eastAsia"/>
-                <w:lang w:eastAsia="zh-TW"/>
-              </w:rPr>
-              <w:t xml:space="preserve"> </w:t>
-            </w:r>
-            <w:r>
-              <w:rPr>
-                <w:rFonts w:ascii="SimSun" w:hAnsi="SimSun" w:cs="SimSun" w:hint="eastAsia"/>
-                <w:lang w:eastAsia="zh-TW"/>
-              </w:rPr>
-              <w:t>不過</w:t>
-            </w:r>
-            <w:r>
-              <w:rPr>
-                <w:rFonts w:ascii="SimSun" w:hAnsi="SimSun" w:cs="SimSun" w:hint="eastAsia"/>
-                <w:lang w:eastAsia="zh-TW"/>
-              </w:rPr>
-              <w:t>目前樂譜</w:t>
-            </w:r>
-            <w:r>
-              <w:rPr>
-                <w:rFonts w:ascii="SimSun" w:hAnsi="SimSun" w:cs="SimSun" w:hint="eastAsia"/>
-                <w:lang w:eastAsia="zh-TW"/>
-              </w:rPr>
-              <w:t>寫的是《</w:t>
-            </w:r>
-            <w:r>
-              <w:rPr>
-                <w:rFonts w:ascii="SimSun" w:hAnsi="SimSun" w:cs="SimSun" w:hint="eastAsia"/>
-                <w:lang w:eastAsia="zh-TW"/>
-              </w:rPr>
-              <w:t>彈簧匣</w:t>
-            </w:r>
-            <w:r>
-              <w:rPr>
-                <w:rFonts w:ascii="SimSun" w:hAnsi="SimSun" w:cs="SimSun" w:hint="eastAsia"/>
-                <w:lang w:eastAsia="zh-TW"/>
-              </w:rPr>
-              <w:t>》。</w:t>
-            </w:r>
-            <w:r>
-              <w:rPr>
-                <w:rFonts w:ascii="SimSun" w:hAnsi="SimSun" w:cs="SimSun" w:hint="eastAsia"/>
-              </w:rPr>
-              <w:t>你更傾向哪個</w:t>
-            </w:r>
-            <w:r>
-              <w:rPr>
-                <w:rFonts w:ascii="SimSun" w:hAnsi="SimSun" w:cs="SimSun" w:hint="eastAsia"/>
-              </w:rPr>
-              <w:t>？</w:t>
+              </w:rPr>
+              <w:t>你更傾向哪個？</w:t>
             </w:r>
           </w:p>
         </w:tc>
@@ -1195,7 +1186,7 @@
             <w:pPr>
               <w:jc w:val="center"/>
               <w:rPr>
-                <w:rFonts w:ascii="Times New Roman" w:eastAsia="Times" w:hAnsi="Times New Roman" w:cs="Times New Roman"/>
+                <w:rFonts w:ascii="Times New Roman" w:hAnsi="Times New Roman" w:cs="Times New Roman"/>
                 <w:color w:val="FF0000"/>
                 <w:lang w:eastAsia="zh-TW"/>
               </w:rPr>
@@ -1215,13 +1206,13 @@
             <w:pPr>
               <w:jc w:val="center"/>
               <w:rPr>
-                <w:rFonts w:ascii="Times" w:eastAsia="Times" w:hAnsi="Times" w:cs="Times"/>
-                <w:lang w:eastAsia="zh-TW"/>
-              </w:rPr>
-            </w:pPr>
-            <w:r>
-              <w:rPr>
-                <w:rFonts w:ascii="Times" w:eastAsia="Times" w:hAnsi="Times" w:cs="Times"/>
+                <w:rFonts w:ascii="Times" w:hAnsi="Times" w:cs="Times"/>
+                <w:lang w:eastAsia="zh-TW"/>
+              </w:rPr>
+            </w:pPr>
+            <w:r>
+              <w:rPr>
+                <w:rFonts w:ascii="Times" w:hAnsi="Times" w:cs="Times"/>
                 <w:lang w:eastAsia="zh-TW"/>
               </w:rPr>
               <w:t>68</w:t>
@@ -1236,13 +1227,13 @@
             <w:pPr>
               <w:jc w:val="center"/>
               <w:rPr>
-                <w:rFonts w:ascii="Times" w:eastAsia="Times" w:hAnsi="Times" w:cs="Times"/>
-                <w:lang w:eastAsia="zh-TW"/>
-              </w:rPr>
-            </w:pPr>
-            <w:r>
-              <w:rPr>
-                <w:rFonts w:ascii="Times" w:eastAsia="Times" w:hAnsi="Times" w:cs="Times"/>
+                <w:rFonts w:ascii="Times" w:hAnsi="Times" w:cs="Times"/>
+                <w:lang w:eastAsia="zh-TW"/>
+              </w:rPr>
+            </w:pPr>
+            <w:r>
+              <w:rPr>
+                <w:rFonts w:ascii="Times" w:hAnsi="Times" w:cs="Times"/>
                 <w:lang w:eastAsia="zh-TW"/>
               </w:rPr>
               <w:t>Tempo</w:t>
@@ -1256,13 +1247,13 @@
           <w:p>
             <w:pPr>
               <w:rPr>
-                <w:rFonts w:ascii="Times" w:eastAsia="Times" w:hAnsi="Times" w:cs="Times"/>
-                <w:lang w:eastAsia="zh-TW"/>
-              </w:rPr>
-            </w:pPr>
-            <w:r>
-              <w:rPr>
-                <w:rFonts w:ascii="Times" w:eastAsia="Times" w:hAnsi="Times" w:cs="Times"/>
+                <w:rFonts w:ascii="Times" w:hAnsi="Times" w:cs="Times"/>
+                <w:lang w:eastAsia="zh-TW"/>
+              </w:rPr>
+            </w:pPr>
+            <w:r>
+              <w:rPr>
+                <w:rFonts w:ascii="Times" w:hAnsi="Times" w:cs="Times"/>
                 <w:lang w:eastAsia="zh-TW"/>
               </w:rPr>
               <w:t xml:space="preserve">Tempo 60 = </w:t>
@@ -1270,7 +1261,7 @@
             <w:proofErr w:type="spellStart"/>
             <w:r>
               <w:rPr>
-                <w:rFonts w:ascii="Times" w:eastAsia="Times" w:hAnsi="Times" w:cs="Times"/>
+                <w:rFonts w:ascii="Times" w:hAnsi="Times" w:cs="Times"/>
                 <w:lang w:eastAsia="zh-TW"/>
               </w:rPr>
               <w:t>tuplet</w:t>
@@ -1278,7 +1269,7 @@
             <w:proofErr w:type="spellEnd"/>
             <w:r>
               <w:rPr>
-                <w:rFonts w:ascii="Times" w:eastAsia="Times" w:hAnsi="Times" w:cs="Times"/>
+                <w:rFonts w:ascii="Times" w:hAnsi="Times" w:cs="Times"/>
                 <w:lang w:eastAsia="zh-TW"/>
               </w:rPr>
               <w:t>?</w:t>
@@ -1294,7 +1285,7 @@
             <w:pPr>
               <w:jc w:val="center"/>
               <w:rPr>
-                <w:rFonts w:ascii="Times" w:eastAsia="Times" w:hAnsi="Times" w:cs="Times"/>
+                <w:rFonts w:ascii="Times" w:hAnsi="Times" w:cs="Times"/>
                 <w:color w:val="FF0000"/>
                 <w:lang w:eastAsia="zh-TW"/>
               </w:rPr>
@@ -1314,12 +1305,12 @@
             <w:pPr>
               <w:jc w:val="center"/>
               <w:rPr>
-                <w:rFonts w:ascii="Times" w:eastAsiaTheme="minorEastAsia" w:hAnsi="Times" w:cs="Times"/>
-              </w:rPr>
-            </w:pPr>
-            <w:r>
-              <w:rPr>
-                <w:rFonts w:ascii="Times" w:eastAsiaTheme="minorEastAsia" w:hAnsi="Times" w:cs="Times"/>
+                <w:rFonts w:ascii="Times" w:hAnsi="Times" w:cs="Times"/>
+              </w:rPr>
+            </w:pPr>
+            <w:r>
+              <w:rPr>
+                <w:rFonts w:ascii="Times" w:hAnsi="Times" w:cs="Times"/>
               </w:rPr>
               <w:t>70</w:t>
             </w:r>
@@ -1333,12 +1324,12 @@
             <w:pPr>
               <w:jc w:val="center"/>
               <w:rPr>
-                <w:rFonts w:ascii="Times" w:eastAsiaTheme="minorEastAsia" w:hAnsi="Times" w:cs="Times"/>
-              </w:rPr>
-            </w:pPr>
-            <w:r>
-              <w:rPr>
-                <w:rFonts w:ascii="Times" w:eastAsiaTheme="minorEastAsia" w:hAnsi="Times" w:cs="Times"/>
+                <w:rFonts w:ascii="Times" w:hAnsi="Times" w:cs="Times"/>
+              </w:rPr>
+            </w:pPr>
+            <w:r>
+              <w:rPr>
+                <w:rFonts w:ascii="Times" w:hAnsi="Times" w:cs="Times"/>
               </w:rPr>
               <w:t>Pipa Solo</w:t>
             </w:r>
@@ -1351,32 +1342,34 @@
           <w:p>
             <w:pPr>
               <w:rPr>
-                <w:rFonts w:ascii="Times" w:eastAsiaTheme="minorEastAsia" w:hAnsi="Times" w:cs="Times"/>
-              </w:rPr>
-            </w:pPr>
-            <w:r>
-              <w:rPr>
-                <w:rFonts w:ascii="Times" w:eastAsiaTheme="minorEastAsia" w:hAnsi="Times" w:cs="Times"/>
+                <w:rFonts w:ascii="Times" w:hAnsi="Times" w:cs="Times"/>
+              </w:rPr>
+            </w:pPr>
+            <w:r>
+              <w:rPr>
+                <w:rFonts w:ascii="Times" w:hAnsi="Times" w:cs="Times"/>
               </w:rPr>
               <w:t>Should there be</w:t>
             </w:r>
             <w:r>
               <w:rPr>
-                <w:rFonts w:ascii="Times" w:eastAsiaTheme="minorEastAsia" w:hAnsi="Times" w:cs="Times"/>
+                <w:rFonts w:ascii="Times" w:hAnsi="Times" w:cs="Times"/>
                 <w:i/>
                 <w:iCs/>
               </w:rPr>
               <w:t xml:space="preserve"> </w:t>
             </w:r>
-            <w:r>
-              <w:rPr>
-                <w:rFonts w:ascii="Times" w:eastAsiaTheme="minorEastAsia" w:hAnsi="Times" w:cs="Times"/>
+            <w:proofErr w:type="gramStart"/>
+            <w:r>
+              <w:rPr>
+                <w:rFonts w:ascii="Times" w:hAnsi="Times" w:cs="Times"/>
               </w:rPr>
               <w:t>an</w:t>
             </w:r>
-            <w:r>
-              <w:rPr>
-                <w:rFonts w:ascii="Times" w:eastAsiaTheme="minorEastAsia" w:hAnsi="Times" w:cs="Times"/>
+            <w:proofErr w:type="gramEnd"/>
+            <w:r>
+              <w:rPr>
+                <w:rFonts w:ascii="Times" w:hAnsi="Times" w:cs="Times"/>
                 <w:b/>
                 <w:bCs/>
                 <w:i/>
@@ -1387,7 +1380,7 @@
             <w:proofErr w:type="spellStart"/>
             <w:r>
               <w:rPr>
-                <w:rFonts w:ascii="Times" w:eastAsiaTheme="minorEastAsia" w:hAnsi="Times" w:cs="Times"/>
+                <w:rFonts w:ascii="Times" w:hAnsi="Times" w:cs="Times"/>
                 <w:b/>
                 <w:bCs/>
                 <w:i/>
@@ -1398,9 +1391,40 @@
             <w:proofErr w:type="spellEnd"/>
             <w:r>
               <w:rPr>
-                <w:rFonts w:ascii="Times" w:eastAsiaTheme="minorEastAsia" w:hAnsi="Times" w:cs="Times"/>
+                <w:rFonts w:ascii="Times" w:hAnsi="Times" w:cs="Times"/>
               </w:rPr>
               <w:t>?</w:t>
+            </w:r>
+          </w:p>
+          <w:p>
+            <w:pPr>
+              <w:rPr>
+                <w:rFonts w:ascii="Times" w:hAnsi="Times" w:cs="Times" w:hint="eastAsia"/>
+              </w:rPr>
+            </w:pPr>
+            <w:r>
+              <w:rPr>
+                <w:rFonts w:ascii="Times" w:hAnsi="Times" w:cs="Times" w:hint="eastAsia"/>
+              </w:rPr>
+              <w:t>應該是</w:t>
+            </w:r>
+            <w:proofErr w:type="spellStart"/>
+            <w:r>
+              <w:rPr>
+                <w:rFonts w:ascii="Times" w:hAnsi="Times" w:cs="Times" w:hint="eastAsia"/>
+                <w:b/>
+                <w:bCs/>
+                <w:i/>
+                <w:iCs/>
+              </w:rPr>
+              <w:t>sfz</w:t>
+            </w:r>
+            <w:proofErr w:type="spellEnd"/>
+            <w:r>
+              <w:rPr>
+                <w:rFonts w:ascii="Times" w:hAnsi="Times" w:cs="Times" w:hint="eastAsia"/>
+              </w:rPr>
+              <w:t xml:space="preserve"> ?</w:t>
             </w:r>
           </w:p>
         </w:tc>
@@ -1413,7 +1437,7 @@
             <w:pPr>
               <w:jc w:val="center"/>
               <w:rPr>
-                <w:rFonts w:ascii="Times" w:eastAsia="Times" w:hAnsi="Times" w:cs="Times"/>
+                <w:rFonts w:ascii="Times" w:hAnsi="Times" w:cs="Times"/>
                 <w:color w:val="FF0000"/>
                 <w:lang w:eastAsia="zh-TW"/>
               </w:rPr>
@@ -1433,12 +1457,12 @@
             <w:pPr>
               <w:jc w:val="center"/>
               <w:rPr>
-                <w:rFonts w:ascii="Times" w:eastAsiaTheme="minorEastAsia" w:hAnsi="Times" w:cs="Times"/>
-              </w:rPr>
-            </w:pPr>
-            <w:r>
-              <w:rPr>
-                <w:rFonts w:ascii="Times" w:eastAsiaTheme="minorEastAsia" w:hAnsi="Times" w:cs="Times"/>
+                <w:rFonts w:ascii="Times" w:hAnsi="Times" w:cs="Times"/>
+              </w:rPr>
+            </w:pPr>
+            <w:r>
+              <w:rPr>
+                <w:rFonts w:ascii="Times" w:hAnsi="Times" w:cs="Times"/>
               </w:rPr>
               <w:t>73</w:t>
             </w:r>
@@ -1452,12 +1476,12 @@
             <w:pPr>
               <w:jc w:val="center"/>
               <w:rPr>
-                <w:rFonts w:ascii="Times" w:eastAsiaTheme="minorEastAsia" w:hAnsi="Times" w:cs="Times"/>
-              </w:rPr>
-            </w:pPr>
-            <w:r>
-              <w:rPr>
-                <w:rFonts w:ascii="Times" w:eastAsiaTheme="minorEastAsia" w:hAnsi="Times" w:cs="Times"/>
+                <w:rFonts w:ascii="Times" w:hAnsi="Times" w:cs="Times"/>
+              </w:rPr>
+            </w:pPr>
+            <w:r>
+              <w:rPr>
+                <w:rFonts w:ascii="Times" w:hAnsi="Times" w:cs="Times"/>
               </w:rPr>
               <w:t>Cello</w:t>
             </w:r>
@@ -1470,14 +1494,36 @@
           <w:p>
             <w:pPr>
               <w:rPr>
-                <w:rFonts w:ascii="Times" w:eastAsiaTheme="minorEastAsia" w:hAnsi="Times" w:cs="Times"/>
-              </w:rPr>
-            </w:pPr>
-            <w:r>
-              <w:rPr>
-                <w:rFonts w:ascii="Times" w:eastAsiaTheme="minorEastAsia" w:hAnsi="Times" w:cs="Times"/>
+                <w:rFonts w:ascii="Times" w:hAnsi="Times" w:cs="Times"/>
+              </w:rPr>
+            </w:pPr>
+            <w:r>
+              <w:rPr>
+                <w:rFonts w:ascii="Times" w:hAnsi="Times" w:cs="Times"/>
               </w:rPr>
               <w:t>Added tenor clef instead of treble.</w:t>
+            </w:r>
+          </w:p>
+          <w:p>
+            <w:pPr>
+              <w:rPr>
+                <w:rFonts w:ascii="Times" w:hAnsi="Times" w:cs="Times" w:hint="eastAsia"/>
+                <w:lang w:eastAsia="zh-TW"/>
+              </w:rPr>
+            </w:pPr>
+            <w:r>
+              <w:rPr>
+                <w:rFonts w:ascii="Times" w:hAnsi="Times" w:cs="Times"/>
+                <w:lang w:eastAsia="zh-TW"/>
+              </w:rPr>
+              <w:t>高音譜號可能更容易閱讀</w:t>
+            </w:r>
+            <w:r>
+              <w:rPr>
+                <w:rFonts w:ascii="Times" w:hAnsi="Times" w:cs="Times" w:hint="eastAsia"/>
+                <w:lang w:eastAsia="zh-TW"/>
+              </w:rPr>
+              <w:t>。</w:t>
             </w:r>
           </w:p>
         </w:tc>
@@ -1490,7 +1536,7 @@
             <w:pPr>
               <w:jc w:val="center"/>
               <w:rPr>
-                <w:rFonts w:ascii="Times" w:eastAsia="Times" w:hAnsi="Times" w:cs="Times"/>
+                <w:rFonts w:ascii="Times" w:hAnsi="Times" w:cs="Times"/>
                 <w:color w:val="FF0000"/>
                 <w:lang w:eastAsia="zh-TW"/>
               </w:rPr>
@@ -1510,12 +1556,12 @@
             <w:pPr>
               <w:jc w:val="center"/>
               <w:rPr>
-                <w:rFonts w:ascii="Times" w:eastAsiaTheme="minorEastAsia" w:hAnsi="Times" w:cs="Times"/>
-              </w:rPr>
-            </w:pPr>
-            <w:r>
-              <w:rPr>
-                <w:rFonts w:ascii="Times" w:eastAsiaTheme="minorEastAsia" w:hAnsi="Times" w:cs="Times"/>
+                <w:rFonts w:ascii="Times" w:hAnsi="Times" w:cs="Times"/>
+              </w:rPr>
+            </w:pPr>
+            <w:r>
+              <w:rPr>
+                <w:rFonts w:ascii="Times" w:hAnsi="Times" w:cs="Times"/>
               </w:rPr>
               <w:t>89</w:t>
             </w:r>
@@ -1529,12 +1575,12 @@
             <w:pPr>
               <w:jc w:val="center"/>
               <w:rPr>
-                <w:rFonts w:ascii="Times" w:eastAsiaTheme="minorEastAsia" w:hAnsi="Times" w:cs="Times"/>
-              </w:rPr>
-            </w:pPr>
-            <w:r>
-              <w:rPr>
-                <w:rFonts w:ascii="Times" w:eastAsiaTheme="minorEastAsia" w:hAnsi="Times" w:cs="Times"/>
+                <w:rFonts w:ascii="Times" w:hAnsi="Times" w:cs="Times"/>
+              </w:rPr>
+            </w:pPr>
+            <w:r>
+              <w:rPr>
+                <w:rFonts w:ascii="Times" w:hAnsi="Times" w:cs="Times"/>
               </w:rPr>
               <w:t>Perc 6, 7</w:t>
             </w:r>
@@ -1547,18 +1593,18 @@
           <w:p>
             <w:pPr>
               <w:rPr>
-                <w:rFonts w:ascii="Times" w:eastAsiaTheme="minorEastAsia" w:hAnsi="Times" w:cs="Times"/>
-              </w:rPr>
-            </w:pPr>
-            <w:r>
-              <w:rPr>
-                <w:rFonts w:ascii="Times" w:eastAsiaTheme="minorEastAsia" w:hAnsi="Times" w:cs="Times"/>
+                <w:rFonts w:ascii="Times" w:hAnsi="Times" w:cs="Times"/>
+              </w:rPr>
+            </w:pPr>
+            <w:r>
+              <w:rPr>
+                <w:rFonts w:ascii="Times" w:hAnsi="Times" w:cs="Times"/>
               </w:rPr>
               <w:t xml:space="preserve">Assumed missing </w:t>
             </w:r>
             <w:r>
               <w:rPr>
-                <w:rFonts w:ascii="Times" w:eastAsiaTheme="minorEastAsia" w:hAnsi="Times" w:cs="Times"/>
+                <w:rFonts w:ascii="Times" w:hAnsi="Times" w:cs="Times"/>
                 <w:b/>
                 <w:bCs/>
                 <w:i/>
@@ -1568,9 +1614,44 @@
             </w:r>
             <w:r>
               <w:rPr>
-                <w:rFonts w:ascii="Times" w:eastAsiaTheme="minorEastAsia" w:hAnsi="Times" w:cs="Times"/>
+                <w:rFonts w:ascii="Times" w:hAnsi="Times" w:cs="Times"/>
               </w:rPr>
               <w:t>?</w:t>
+            </w:r>
+          </w:p>
+          <w:p>
+            <w:pPr>
+              <w:rPr>
+                <w:rFonts w:ascii="Times" w:hAnsi="Times" w:cs="Times" w:hint="eastAsia"/>
+              </w:rPr>
+            </w:pPr>
+            <w:r>
+              <w:rPr>
+                <w:rFonts w:ascii="Times" w:hAnsi="Times" w:cs="Times"/>
+              </w:rPr>
+              <w:t>失蹤</w:t>
+            </w:r>
+            <w:r>
+              <w:rPr>
+                <w:rFonts w:ascii="Times" w:hAnsi="Times" w:cs="Times" w:hint="eastAsia"/>
+              </w:rPr>
+              <w:t>的</w:t>
+            </w:r>
+            <w:r>
+              <w:rPr>
+                <w:rFonts w:ascii="Times" w:hAnsi="Times" w:cs="Times" w:hint="eastAsia"/>
+                <w:b/>
+                <w:bCs/>
+                <w:i/>
+                <w:iCs/>
+              </w:rPr>
+              <w:t>p</w:t>
+            </w:r>
+            <w:r>
+              <w:rPr>
+                <w:rFonts w:ascii="Times" w:hAnsi="Times" w:cs="Times" w:hint="eastAsia"/>
+              </w:rPr>
+              <w:t xml:space="preserve"> ?</w:t>
             </w:r>
           </w:p>
         </w:tc>
@@ -1583,7 +1664,7 @@
             <w:pPr>
               <w:jc w:val="center"/>
               <w:rPr>
-                <w:rFonts w:ascii="Times" w:eastAsia="Times" w:hAnsi="Times" w:cs="Times"/>
+                <w:rFonts w:ascii="Times" w:hAnsi="Times" w:cs="Times"/>
                 <w:color w:val="FF0000"/>
                 <w:lang w:eastAsia="zh-TW"/>
               </w:rPr>
@@ -1603,12 +1684,12 @@
             <w:pPr>
               <w:jc w:val="center"/>
               <w:rPr>
-                <w:rFonts w:ascii="Times" w:eastAsiaTheme="minorEastAsia" w:hAnsi="Times" w:cs="Times"/>
-              </w:rPr>
-            </w:pPr>
-            <w:r>
-              <w:rPr>
-                <w:rFonts w:ascii="Times" w:eastAsiaTheme="minorEastAsia" w:hAnsi="Times" w:cs="Times"/>
+                <w:rFonts w:ascii="Times" w:hAnsi="Times" w:cs="Times"/>
+              </w:rPr>
+            </w:pPr>
+            <w:r>
+              <w:rPr>
+                <w:rFonts w:ascii="Times" w:hAnsi="Times" w:cs="Times"/>
               </w:rPr>
               <w:t>108-110</w:t>
             </w:r>
@@ -1622,12 +1703,12 @@
             <w:pPr>
               <w:jc w:val="center"/>
               <w:rPr>
-                <w:rFonts w:ascii="Times" w:eastAsiaTheme="minorEastAsia" w:hAnsi="Times" w:cs="Times"/>
-              </w:rPr>
-            </w:pPr>
-            <w:r>
-              <w:rPr>
-                <w:rFonts w:ascii="Times" w:eastAsiaTheme="minorEastAsia" w:hAnsi="Times" w:cs="Times"/>
+                <w:rFonts w:ascii="Times" w:hAnsi="Times" w:cs="Times"/>
+              </w:rPr>
+            </w:pPr>
+            <w:r>
+              <w:rPr>
+                <w:rFonts w:ascii="Times" w:hAnsi="Times" w:cs="Times"/>
               </w:rPr>
               <w:t>QD</w:t>
             </w:r>
@@ -1640,14 +1721,33 @@
           <w:p>
             <w:pPr>
               <w:rPr>
-                <w:rFonts w:ascii="Times" w:eastAsiaTheme="minorEastAsia" w:hAnsi="Times" w:cs="Times"/>
-              </w:rPr>
-            </w:pPr>
-            <w:r>
-              <w:rPr>
-                <w:rFonts w:ascii="Times" w:eastAsiaTheme="minorEastAsia" w:hAnsi="Times" w:cs="Times"/>
+                <w:rFonts w:ascii="Times" w:hAnsi="Times" w:cs="Times"/>
+              </w:rPr>
+            </w:pPr>
+            <w:r>
+              <w:rPr>
+                <w:rFonts w:ascii="Times" w:hAnsi="Times" w:cs="Times"/>
               </w:rPr>
               <w:t>Assumed missing staccatos?</w:t>
+            </w:r>
+          </w:p>
+          <w:p>
+            <w:pPr>
+              <w:rPr>
+                <w:rFonts w:ascii="Times" w:hAnsi="Times" w:cs="Times"/>
+              </w:rPr>
+            </w:pPr>
+            <w:r>
+              <w:rPr>
+                <w:rFonts w:ascii="Times" w:hAnsi="Times" w:cs="Times"/>
+              </w:rPr>
+              <w:t>失蹤斷奏</w:t>
+            </w:r>
+            <w:r>
+              <w:rPr>
+                <w:rFonts w:ascii="Times" w:hAnsi="Times" w:cs="Times" w:hint="eastAsia"/>
+              </w:rPr>
+              <w:t>?</w:t>
             </w:r>
           </w:p>
         </w:tc>
@@ -1660,7 +1760,7 @@
             <w:pPr>
               <w:jc w:val="center"/>
               <w:rPr>
-                <w:rFonts w:ascii="Times" w:eastAsia="Times" w:hAnsi="Times" w:cs="Times"/>
+                <w:rFonts w:ascii="Times" w:hAnsi="Times" w:cs="Times"/>
                 <w:color w:val="FF0000"/>
                 <w:lang w:eastAsia="zh-TW"/>
               </w:rPr>
@@ -1680,12 +1780,12 @@
             <w:pPr>
               <w:jc w:val="center"/>
               <w:rPr>
-                <w:rFonts w:ascii="Times" w:eastAsiaTheme="minorEastAsia" w:hAnsi="Times" w:cs="Times"/>
-              </w:rPr>
-            </w:pPr>
-            <w:r>
-              <w:rPr>
-                <w:rFonts w:ascii="Times" w:eastAsiaTheme="minorEastAsia" w:hAnsi="Times" w:cs="Times"/>
+                <w:rFonts w:ascii="Times" w:hAnsi="Times" w:cs="Times"/>
+              </w:rPr>
+            </w:pPr>
+            <w:r>
+              <w:rPr>
+                <w:rFonts w:ascii="Times" w:hAnsi="Times" w:cs="Times"/>
               </w:rPr>
               <w:t>150</w:t>
             </w:r>
@@ -1699,19 +1799,19 @@
             <w:pPr>
               <w:jc w:val="center"/>
               <w:rPr>
-                <w:rFonts w:ascii="Times" w:eastAsiaTheme="minorEastAsia" w:hAnsi="Times" w:cs="Times"/>
-              </w:rPr>
-            </w:pPr>
-            <w:r>
-              <w:rPr>
-                <w:rFonts w:ascii="Times" w:eastAsiaTheme="minorEastAsia" w:hAnsi="Times" w:cs="Times"/>
+                <w:rFonts w:ascii="Times" w:hAnsi="Times" w:cs="Times"/>
+              </w:rPr>
+            </w:pPr>
+            <w:r>
+              <w:rPr>
+                <w:rFonts w:ascii="Times" w:hAnsi="Times" w:cs="Times"/>
               </w:rPr>
               <w:t xml:space="preserve">XD, </w:t>
             </w:r>
             <w:proofErr w:type="spellStart"/>
             <w:r>
               <w:rPr>
-                <w:rFonts w:ascii="Times" w:eastAsiaTheme="minorEastAsia" w:hAnsi="Times" w:cs="Times"/>
+                <w:rFonts w:ascii="Times" w:hAnsi="Times" w:cs="Times"/>
               </w:rPr>
               <w:t>GYSh</w:t>
             </w:r>
@@ -1725,18 +1825,19 @@
           <w:p>
             <w:pPr>
               <w:rPr>
-                <w:rFonts w:ascii="Times" w:eastAsiaTheme="minorEastAsia" w:hAnsi="Times" w:cs="Times"/>
-              </w:rPr>
-            </w:pPr>
-            <w:r>
-              <w:rPr>
-                <w:rFonts w:ascii="Times" w:eastAsiaTheme="minorEastAsia" w:hAnsi="Times" w:cs="Times"/>
+                <w:rFonts w:ascii="Times" w:hAnsi="Times" w:cs="Times"/>
+              </w:rPr>
+            </w:pPr>
+            <w:r>
+              <w:rPr>
+                <w:rFonts w:ascii="Times" w:hAnsi="Times" w:cs="Times"/>
               </w:rPr>
               <w:t xml:space="preserve">Missing </w:t>
             </w:r>
-            <w:r>
-              <w:rPr>
-                <w:rFonts w:ascii="Times" w:eastAsiaTheme="minorEastAsia" w:hAnsi="Times" w:cs="Times"/>
+            <w:proofErr w:type="gramStart"/>
+            <w:r>
+              <w:rPr>
+                <w:rFonts w:ascii="Times" w:hAnsi="Times" w:cs="Times"/>
                 <w:b/>
                 <w:bCs/>
                 <w:i/>
@@ -1746,7 +1847,53 @@
             </w:r>
             <w:r>
               <w:rPr>
-                <w:rFonts w:ascii="Times" w:eastAsiaTheme="minorEastAsia" w:hAnsi="Times" w:cs="Times"/>
+                <w:rFonts w:ascii="Times" w:hAnsi="Times" w:cs="Times" w:hint="eastAsia"/>
+                <w:b/>
+                <w:bCs/>
+                <w:i/>
+                <w:iCs/>
+              </w:rPr>
+              <w:t xml:space="preserve"> </w:t>
+            </w:r>
+            <w:r>
+              <w:rPr>
+                <w:rFonts w:ascii="Times" w:hAnsi="Times" w:cs="Times"/>
+              </w:rPr>
+              <w:t>?</w:t>
+            </w:r>
+            <w:proofErr w:type="gramEnd"/>
+          </w:p>
+          <w:p>
+            <w:pPr>
+              <w:rPr>
+                <w:rFonts w:ascii="Times" w:hAnsi="Times" w:cs="Times"/>
+              </w:rPr>
+            </w:pPr>
+            <w:r>
+              <w:rPr>
+                <w:rFonts w:ascii="Times" w:hAnsi="Times" w:cs="Times"/>
+              </w:rPr>
+              <w:t>失蹤</w:t>
+            </w:r>
+            <w:r>
+              <w:rPr>
+                <w:rFonts w:ascii="Times" w:hAnsi="Times" w:cs="Times" w:hint="eastAsia"/>
+              </w:rPr>
+              <w:t>的</w:t>
+            </w:r>
+            <w:r>
+              <w:rPr>
+                <w:rFonts w:ascii="Times" w:hAnsi="Times" w:cs="Times" w:hint="eastAsia"/>
+                <w:b/>
+                <w:bCs/>
+                <w:i/>
+                <w:iCs/>
+              </w:rPr>
+              <w:t xml:space="preserve">mf </w:t>
+            </w:r>
+            <w:r>
+              <w:rPr>
+                <w:rFonts w:ascii="Times" w:hAnsi="Times" w:cs="Times" w:hint="eastAsia"/>
               </w:rPr>
               <w:t>?</w:t>
             </w:r>
@@ -1761,7 +1908,7 @@
             <w:pPr>
               <w:jc w:val="center"/>
               <w:rPr>
-                <w:rFonts w:ascii="Times" w:eastAsia="Times" w:hAnsi="Times" w:cs="Times"/>
+                <w:rFonts w:ascii="Times" w:hAnsi="Times" w:cs="Times"/>
                 <w:color w:val="FF0000"/>
                 <w:lang w:eastAsia="zh-TW"/>
               </w:rPr>
@@ -1781,12 +1928,12 @@
             <w:pPr>
               <w:jc w:val="center"/>
               <w:rPr>
-                <w:rFonts w:ascii="Times" w:eastAsiaTheme="minorEastAsia" w:hAnsi="Times" w:cs="Times"/>
-              </w:rPr>
-            </w:pPr>
-            <w:r>
-              <w:rPr>
-                <w:rFonts w:ascii="Times" w:eastAsiaTheme="minorEastAsia" w:hAnsi="Times" w:cs="Times"/>
+                <w:rFonts w:ascii="Times" w:hAnsi="Times" w:cs="Times"/>
+              </w:rPr>
+            </w:pPr>
+            <w:r>
+              <w:rPr>
+                <w:rFonts w:ascii="Times" w:hAnsi="Times" w:cs="Times"/>
               </w:rPr>
               <w:t>169</w:t>
             </w:r>
@@ -1800,12 +1947,12 @@
             <w:pPr>
               <w:jc w:val="center"/>
               <w:rPr>
-                <w:rFonts w:ascii="Times" w:eastAsiaTheme="minorEastAsia" w:hAnsi="Times" w:cs="Times"/>
-              </w:rPr>
-            </w:pPr>
-            <w:r>
-              <w:rPr>
-                <w:rFonts w:ascii="Times" w:eastAsiaTheme="minorEastAsia" w:hAnsi="Times" w:cs="Times"/>
+                <w:rFonts w:ascii="Times" w:hAnsi="Times" w:cs="Times"/>
+              </w:rPr>
+            </w:pPr>
+            <w:r>
+              <w:rPr>
+                <w:rFonts w:ascii="Times" w:hAnsi="Times" w:cs="Times"/>
               </w:rPr>
               <w:t>Pipa Solo</w:t>
             </w:r>
@@ -1818,18 +1965,18 @@
           <w:p>
             <w:pPr>
               <w:rPr>
-                <w:rFonts w:ascii="Times" w:eastAsiaTheme="minorEastAsia" w:hAnsi="Times" w:cs="Times"/>
-              </w:rPr>
-            </w:pPr>
-            <w:r>
-              <w:rPr>
-                <w:rFonts w:ascii="Times" w:eastAsiaTheme="minorEastAsia" w:hAnsi="Times" w:cs="Times"/>
+                <w:rFonts w:ascii="Times" w:hAnsi="Times" w:cs="Times"/>
+              </w:rPr>
+            </w:pPr>
+            <w:r>
+              <w:rPr>
+                <w:rFonts w:ascii="Times" w:hAnsi="Times" w:cs="Times"/>
               </w:rPr>
               <w:t xml:space="preserve">Missing </w:t>
             </w:r>
             <w:r>
               <w:rPr>
-                <w:rFonts w:ascii="Times" w:eastAsiaTheme="minorEastAsia" w:hAnsi="Times" w:cs="Times"/>
+                <w:rFonts w:ascii="Times" w:hAnsi="Times" w:cs="Times"/>
                 <w:b/>
                 <w:bCs/>
                 <w:i/>
@@ -1839,7 +1986,42 @@
             </w:r>
             <w:r>
               <w:rPr>
-                <w:rFonts w:ascii="Times" w:eastAsiaTheme="minorEastAsia" w:hAnsi="Times" w:cs="Times"/>
+                <w:rFonts w:ascii="Times" w:hAnsi="Times" w:cs="Times"/>
+              </w:rPr>
+              <w:t>?</w:t>
+            </w:r>
+          </w:p>
+          <w:p>
+            <w:pPr>
+              <w:rPr>
+                <w:rFonts w:ascii="Times" w:hAnsi="Times" w:cs="Times"/>
+              </w:rPr>
+            </w:pPr>
+            <w:r>
+              <w:rPr>
+                <w:rFonts w:ascii="Times" w:hAnsi="Times" w:cs="Times"/>
+              </w:rPr>
+              <w:t>失蹤</w:t>
+            </w:r>
+            <w:r>
+              <w:rPr>
+                <w:rFonts w:ascii="Times" w:hAnsi="Times" w:cs="Times" w:hint="eastAsia"/>
+              </w:rPr>
+              <w:t>的</w:t>
+            </w:r>
+            <w:r>
+              <w:rPr>
+                <w:rFonts w:ascii="Times" w:hAnsi="Times" w:cs="Times" w:hint="eastAsia"/>
+                <w:b/>
+                <w:bCs/>
+                <w:i/>
+                <w:iCs/>
+              </w:rPr>
+              <w:t xml:space="preserve">mf </w:t>
+            </w:r>
+            <w:r>
+              <w:rPr>
+                <w:rFonts w:ascii="Times" w:hAnsi="Times" w:cs="Times" w:hint="eastAsia"/>
               </w:rPr>
               <w:t>?</w:t>
             </w:r>
@@ -1854,7 +2036,7 @@
             <w:pPr>
               <w:jc w:val="center"/>
               <w:rPr>
-                <w:rFonts w:ascii="Times" w:eastAsia="Times" w:hAnsi="Times" w:cs="Times"/>
+                <w:rFonts w:ascii="Times" w:hAnsi="Times" w:cs="Times"/>
                 <w:color w:val="FF0000"/>
                 <w:lang w:eastAsia="zh-TW"/>
               </w:rPr>
@@ -1874,12 +2056,12 @@
             <w:pPr>
               <w:jc w:val="center"/>
               <w:rPr>
-                <w:rFonts w:ascii="Times" w:eastAsiaTheme="minorEastAsia" w:hAnsi="Times" w:cs="Times"/>
-              </w:rPr>
-            </w:pPr>
-            <w:r>
-              <w:rPr>
-                <w:rFonts w:ascii="Times" w:eastAsiaTheme="minorEastAsia" w:hAnsi="Times" w:cs="Times" w:hint="eastAsia"/>
+                <w:rFonts w:ascii="Times" w:hAnsi="Times" w:cs="Times"/>
+              </w:rPr>
+            </w:pPr>
+            <w:r>
+              <w:rPr>
+                <w:rFonts w:ascii="Times" w:hAnsi="Times" w:cs="Times" w:hint="eastAsia"/>
               </w:rPr>
               <w:t>292</w:t>
             </w:r>
@@ -1893,18 +2075,18 @@
             <w:pPr>
               <w:jc w:val="center"/>
               <w:rPr>
-                <w:rFonts w:ascii="Times" w:eastAsiaTheme="minorEastAsia" w:hAnsi="Times" w:cs="Times"/>
-              </w:rPr>
-            </w:pPr>
-            <w:r>
-              <w:rPr>
-                <w:rFonts w:ascii="Times" w:eastAsiaTheme="minorEastAsia" w:hAnsi="Times" w:cs="Times" w:hint="eastAsia"/>
+                <w:rFonts w:ascii="Times" w:hAnsi="Times" w:cs="Times"/>
+              </w:rPr>
+            </w:pPr>
+            <w:r>
+              <w:rPr>
+                <w:rFonts w:ascii="Times" w:hAnsi="Times" w:cs="Times" w:hint="eastAsia"/>
               </w:rPr>
               <w:t>Perc 3-6</w:t>
             </w:r>
             <w:r>
               <w:rPr>
-                <w:rFonts w:ascii="Times" w:eastAsiaTheme="minorEastAsia" w:hAnsi="Times" w:cs="Times"/>
+                <w:rFonts w:ascii="Times" w:hAnsi="Times" w:cs="Times"/>
               </w:rPr>
               <w:t xml:space="preserve"> </w:t>
             </w:r>
@@ -1917,82 +2099,139 @@
           <w:p>
             <w:pPr>
               <w:rPr>
-                <w:rFonts w:ascii="Times" w:eastAsiaTheme="minorEastAsia" w:hAnsi="Times" w:cs="Times"/>
-              </w:rPr>
-            </w:pPr>
-            <w:r>
-              <w:rPr>
-                <w:rFonts w:ascii="Times" w:eastAsiaTheme="minorEastAsia" w:hAnsi="Times" w:cs="Times" w:hint="eastAsia"/>
-              </w:rPr>
-              <w:t>Windchimes and Glass</w:t>
-            </w:r>
-            <w:r>
-              <w:rPr>
-                <w:rFonts w:ascii="Times" w:eastAsiaTheme="minorEastAsia" w:hAnsi="Times" w:cs="Times"/>
+                <w:rFonts w:ascii="Times" w:hAnsi="Times" w:cs="Times"/>
+              </w:rPr>
+            </w:pPr>
+            <w:r>
+              <w:rPr>
+                <w:rFonts w:ascii="Times" w:hAnsi="Times" w:cs="Times" w:hint="eastAsia"/>
+              </w:rPr>
+              <w:t>Windchimes</w:t>
+            </w:r>
+            <w:r>
+              <w:rPr>
+                <w:rFonts w:ascii="Times" w:hAnsi="Times" w:cs="Times" w:hint="eastAsia"/>
+              </w:rPr>
+              <w:t xml:space="preserve">, </w:t>
+            </w:r>
+            <w:proofErr w:type="spellStart"/>
+            <w:r>
+              <w:rPr>
+                <w:rFonts w:ascii="Times" w:hAnsi="Times" w:cs="Times"/>
+              </w:rPr>
+              <w:t>glasschimes</w:t>
+            </w:r>
+            <w:proofErr w:type="spellEnd"/>
+            <w:r>
+              <w:rPr>
+                <w:rFonts w:ascii="Times" w:hAnsi="Times" w:cs="Times"/>
+              </w:rPr>
+              <w:t>, and</w:t>
+            </w:r>
+            <w:r>
+              <w:rPr>
+                <w:rFonts w:ascii="Times" w:hAnsi="Times" w:cs="Times" w:hint="eastAsia"/>
               </w:rPr>
               <w:t xml:space="preserve"> </w:t>
             </w:r>
-            <w:r>
-              <w:rPr>
-                <w:rFonts w:ascii="Times" w:eastAsiaTheme="minorEastAsia" w:hAnsi="Times" w:cs="Times" w:hint="eastAsia"/>
-              </w:rPr>
-              <w:t>chimes are not listed in the instrument list.</w:t>
-            </w:r>
-          </w:p>
-          <w:p>
-            <w:pPr>
-              <w:rPr>
-                <w:rFonts w:ascii="Times" w:eastAsiaTheme="minorEastAsia" w:hAnsi="Times" w:cs="Times"/>
-              </w:rPr>
-            </w:pPr>
-          </w:p>
-          <w:p>
-            <w:pPr>
-              <w:rPr>
-                <w:rFonts w:ascii="Times" w:eastAsiaTheme="minorEastAsia" w:hAnsi="Times" w:cs="Times"/>
-              </w:rPr>
-            </w:pPr>
-            <w:r>
-              <w:rPr>
-                <w:rFonts w:ascii="Times" w:eastAsiaTheme="minorEastAsia" w:hAnsi="Times" w:cs="Times"/>
-              </w:rPr>
-              <w:t>Likewise, is glass</w:t>
-            </w:r>
-            <w:r>
-              <w:rPr>
-                <w:rFonts w:ascii="Times" w:eastAsiaTheme="minorEastAsia" w:hAnsi="Times" w:cs="Times"/>
+            <w:proofErr w:type="spellStart"/>
+            <w:r>
+              <w:rPr>
+                <w:rFonts w:ascii="Times" w:hAnsi="Times" w:cs="Times" w:hint="eastAsia"/>
+              </w:rPr>
+              <w:t>woodchimes</w:t>
+            </w:r>
+            <w:proofErr w:type="spellEnd"/>
+            <w:r>
+              <w:rPr>
+                <w:rFonts w:ascii="Times" w:hAnsi="Times" w:cs="Times" w:hint="eastAsia"/>
               </w:rPr>
               <w:t xml:space="preserve"> </w:t>
             </w:r>
             <w:r>
               <w:rPr>
-                <w:rFonts w:ascii="Times" w:eastAsiaTheme="minorEastAsia" w:hAnsi="Times" w:cs="Times"/>
-              </w:rPr>
-              <w:t xml:space="preserve">chime and windchime </w:t>
-            </w:r>
-            <w:r>
-              <w:rPr>
-                <w:rFonts w:ascii="Times" w:eastAsiaTheme="minorEastAsia" w:hAnsi="Times" w:cs="Times"/>
-              </w:rPr>
-              <w:t xml:space="preserve">mean to be the </w:t>
-            </w:r>
-            <w:r>
-              <w:rPr>
-                <w:rFonts w:ascii="Times" w:eastAsiaTheme="minorEastAsia" w:hAnsi="Times" w:cs="Times"/>
-              </w:rPr>
-              <w:t>same instrument?</w:t>
-            </w:r>
-            <w:r>
-              <w:rPr>
-                <w:rFonts w:ascii="Times" w:eastAsiaTheme="minorEastAsia" w:hAnsi="Times" w:cs="Times"/>
-              </w:rPr>
-              <w:t xml:space="preserve"> Their Chinese translations have them the same. </w:t>
-            </w:r>
-            <w:r>
-              <w:rPr>
-                <w:rFonts w:ascii="Times" w:eastAsiaTheme="minorEastAsia" w:hAnsi="Times" w:cs="Times"/>
+                <w:rFonts w:ascii="Times" w:hAnsi="Times" w:cs="Times" w:hint="eastAsia"/>
+              </w:rPr>
+              <w:t>are not listed in the instrument list</w:t>
+            </w:r>
+            <w:r>
+              <w:rPr>
+                <w:rFonts w:ascii="Times" w:hAnsi="Times" w:cs="Times" w:hint="eastAsia"/>
+              </w:rPr>
+              <w:t>.</w:t>
+            </w:r>
+          </w:p>
+          <w:p>
+            <w:pPr>
+              <w:rPr>
+                <w:rFonts w:ascii="Times" w:hAnsi="Times" w:cs="Times"/>
+              </w:rPr>
+            </w:pPr>
+          </w:p>
+          <w:p>
+            <w:pPr>
+              <w:rPr>
+                <w:rFonts w:ascii="Times" w:hAnsi="Times" w:cs="Times" w:hint="eastAsia"/>
+                <w:lang w:val="en-GB" w:eastAsia="zh-TW"/>
+              </w:rPr>
+            </w:pPr>
+            <w:r>
+              <w:rPr>
+                <w:rFonts w:ascii="Times" w:hAnsi="Times" w:cs="Times"/>
+                <w:lang w:eastAsia="zh-TW"/>
+              </w:rPr>
+              <w:t>樂器列表沒有列出風鈴</w:t>
+            </w:r>
+            <w:r>
+              <w:rPr>
+                <w:rFonts w:ascii="Times" w:hAnsi="Times" w:cs="Times" w:hint="eastAsia"/>
+                <w:lang w:eastAsia="zh-TW"/>
+              </w:rPr>
+              <w:t>，</w:t>
+            </w:r>
+            <w:r>
+              <w:rPr>
+                <w:rFonts w:ascii="Times" w:hAnsi="Times" w:cs="Times" w:hint="eastAsia"/>
+                <w:lang w:val="en-GB" w:eastAsia="zh-TW"/>
+              </w:rPr>
+              <w:t>且不說</w:t>
+            </w:r>
+            <w:r>
+              <w:rPr>
+                <w:rFonts w:ascii="Times" w:hAnsi="Times" w:cs="Times" w:hint="eastAsia"/>
+                <w:lang w:val="en-GB" w:eastAsia="zh-TW"/>
+              </w:rPr>
+              <w:t>“風”，“玻”，“木”</w:t>
+            </w:r>
+            <w:r>
+              <w:rPr>
+                <w:rFonts w:ascii="Times" w:hAnsi="Times" w:cs="Times" w:hint="eastAsia"/>
+                <w:lang w:val="en-GB" w:eastAsia="zh-TW"/>
               </w:rPr>
               <w:t xml:space="preserve"> </w:t>
+            </w:r>
+            <w:proofErr w:type="gramStart"/>
+            <w:r>
+              <w:rPr>
+                <w:rFonts w:ascii="Times" w:hAnsi="Times" w:cs="Times" w:hint="eastAsia"/>
+                <w:lang w:val="en-GB" w:eastAsia="zh-TW"/>
+              </w:rPr>
+              <w:t>種</w:t>
+            </w:r>
+            <w:r>
+              <w:rPr>
+                <w:rFonts w:ascii="Times" w:hAnsi="Times" w:cs="Times" w:hint="eastAsia"/>
+                <w:lang w:val="en-GB" w:eastAsia="zh-TW"/>
+              </w:rPr>
+              <w:t>鈴</w:t>
+            </w:r>
+            <w:proofErr w:type="gramEnd"/>
+            <w:r>
+              <w:rPr>
+                <w:rFonts w:ascii="Times" w:hAnsi="Times" w:cs="Times" w:hint="eastAsia"/>
+                <w:lang w:val="en-GB" w:eastAsia="zh-TW"/>
+              </w:rPr>
+              <w:t>。</w:t>
             </w:r>
           </w:p>
         </w:tc>
@@ -2005,7 +2244,7 @@
             <w:pPr>
               <w:jc w:val="center"/>
               <w:rPr>
-                <w:rFonts w:ascii="Times" w:eastAsia="Times" w:hAnsi="Times" w:cs="Times"/>
+                <w:rFonts w:ascii="Times" w:hAnsi="Times" w:cs="Times"/>
                 <w:color w:val="FF0000"/>
                 <w:lang w:eastAsia="zh-TW"/>
               </w:rPr>
@@ -2025,13 +2264,13 @@
             <w:pPr>
               <w:jc w:val="center"/>
               <w:rPr>
-                <w:rFonts w:ascii="Times" w:eastAsia="Times" w:hAnsi="Times" w:cs="Times"/>
-                <w:lang w:eastAsia="zh-TW"/>
-              </w:rPr>
-            </w:pPr>
-            <w:r>
-              <w:rPr>
-                <w:rFonts w:ascii="Times" w:eastAsia="Times" w:hAnsi="Times" w:cs="Times"/>
+                <w:rFonts w:ascii="Times" w:hAnsi="Times" w:cs="Times"/>
+                <w:lang w:eastAsia="zh-TW"/>
+              </w:rPr>
+            </w:pPr>
+            <w:r>
+              <w:rPr>
+                <w:rFonts w:ascii="Times" w:hAnsi="Times" w:cs="Times"/>
                 <w:lang w:eastAsia="zh-TW"/>
               </w:rPr>
               <w:t>188-234</w:t>
@@ -2046,13 +2285,13 @@
             <w:pPr>
               <w:jc w:val="center"/>
               <w:rPr>
-                <w:rFonts w:ascii="Times" w:eastAsia="Times" w:hAnsi="Times" w:cs="Times"/>
-                <w:lang w:eastAsia="zh-TW"/>
-              </w:rPr>
-            </w:pPr>
-            <w:r>
-              <w:rPr>
-                <w:rFonts w:ascii="Times" w:eastAsia="Times" w:hAnsi="Times" w:cs="Times"/>
+                <w:rFonts w:ascii="Times" w:hAnsi="Times" w:cs="Times"/>
+                <w:lang w:eastAsia="zh-TW"/>
+              </w:rPr>
+            </w:pPr>
+            <w:r>
+              <w:rPr>
+                <w:rFonts w:ascii="Times" w:hAnsi="Times" w:cs="Times"/>
                 <w:lang w:eastAsia="zh-TW"/>
               </w:rPr>
               <w:t>Pipa Solo</w:t>
@@ -2066,16 +2305,46 @@
           <w:p>
             <w:pPr>
               <w:rPr>
-                <w:rFonts w:ascii="Times" w:eastAsia="Times" w:hAnsi="Times" w:cs="Times"/>
-                <w:lang w:eastAsia="zh-TW"/>
-              </w:rPr>
-            </w:pPr>
-            <w:r>
-              <w:rPr>
-                <w:rFonts w:ascii="Times" w:eastAsia="Times" w:hAnsi="Times" w:cs="Times"/>
+                <w:rFonts w:ascii="Times" w:hAnsi="Times" w:cs="Times"/>
+              </w:rPr>
+            </w:pPr>
+            <w:r>
+              <w:rPr>
+                <w:rFonts w:ascii="Times" w:hAnsi="Times" w:cs="Times"/>
                 <w:lang w:eastAsia="zh-TW"/>
               </w:rPr>
               <w:t xml:space="preserve">Replaced excessive ledger lines with alternative scoring solutions to make it easier to read. </w:t>
+            </w:r>
+          </w:p>
+          <w:p>
+            <w:pPr>
+              <w:rPr>
+                <w:rFonts w:ascii="Times" w:hAnsi="Times" w:cs="Times" w:hint="eastAsia"/>
+                <w:lang w:eastAsia="zh-TW"/>
+              </w:rPr>
+            </w:pPr>
+            <w:r>
+              <w:rPr>
+                <w:rFonts w:ascii="Times" w:hAnsi="Times" w:cs="Times"/>
+                <w:lang w:eastAsia="zh-TW"/>
+              </w:rPr>
+              <w:t>刪除了過多的</w:t>
+            </w:r>
+            <w:proofErr w:type="gramStart"/>
+            <w:r>
+              <w:rPr>
+                <w:rFonts w:ascii="Times" w:hAnsi="Times" w:cs="Times"/>
+                <w:lang w:eastAsia="zh-TW"/>
+              </w:rPr>
+              <w:t>分類帳</w:t>
+            </w:r>
+            <w:proofErr w:type="gramEnd"/>
+            <w:r>
+              <w:rPr>
+                <w:rFonts w:ascii="Times" w:hAnsi="Times" w:cs="Times"/>
+                <w:lang w:eastAsia="zh-TW"/>
+              </w:rPr>
+              <w:t>線。應該更容易閱讀了。</w:t>
             </w:r>
           </w:p>
         </w:tc>
@@ -2108,13 +2377,13 @@
             <w:pPr>
               <w:jc w:val="center"/>
               <w:rPr>
-                <w:rFonts w:ascii="Times" w:eastAsia="Times" w:hAnsi="Times" w:cs="Times"/>
-                <w:lang w:eastAsia="zh-TW"/>
-              </w:rPr>
-            </w:pPr>
-            <w:r>
-              <w:rPr>
-                <w:rFonts w:ascii="Times" w:eastAsia="Times" w:hAnsi="Times" w:cs="Times"/>
+                <w:rFonts w:ascii="Times" w:hAnsi="Times" w:cs="Times"/>
+                <w:lang w:eastAsia="zh-TW"/>
+              </w:rPr>
+            </w:pPr>
+            <w:r>
+              <w:rPr>
+                <w:rFonts w:ascii="Times" w:hAnsi="Times" w:cs="Times"/>
                 <w:lang w:eastAsia="zh-TW"/>
               </w:rPr>
               <w:t>293</w:t>
@@ -2129,13 +2398,13 @@
             <w:pPr>
               <w:jc w:val="center"/>
               <w:rPr>
-                <w:rFonts w:ascii="Times" w:eastAsia="Times" w:hAnsi="Times" w:cs="Times"/>
+                <w:rFonts w:ascii="Times" w:hAnsi="Times" w:cs="Times"/>
                 <w:lang w:val="en-US" w:eastAsia="zh-TW"/>
               </w:rPr>
             </w:pPr>
             <w:r>
               <w:rPr>
-                <w:rFonts w:ascii="Times" w:eastAsia="Times" w:hAnsi="Times" w:cs="Times"/>
+                <w:rFonts w:ascii="Times" w:hAnsi="Times" w:cs="Times"/>
                 <w:lang w:val="en-US" w:eastAsia="zh-TW"/>
               </w:rPr>
               <w:t>Contrabass</w:t>
@@ -2149,36 +2418,19 @@
           <w:p>
             <w:pPr>
               <w:rPr>
-                <w:rFonts w:ascii="Times" w:eastAsia="Times" w:hAnsi="Times" w:cs="Times"/>
-                <w:lang w:eastAsia="zh-TW"/>
-              </w:rPr>
-            </w:pPr>
-            <w:r>
-              <w:rPr>
-                <w:rFonts w:ascii="Times" w:eastAsia="Times" w:hAnsi="Times" w:cs="Times"/>
-                <w:lang w:eastAsia="zh-TW"/>
-              </w:rPr>
-              <w:t xml:space="preserve">Edited </w:t>
-            </w:r>
-            <w:proofErr w:type="spellStart"/>
-            <w:r>
-              <w:rPr>
-                <w:rFonts w:ascii="Times" w:eastAsia="Times" w:hAnsi="Times" w:cs="Times"/>
-                <w:lang w:eastAsia="zh-TW"/>
-              </w:rPr>
-              <w:t>sul</w:t>
-            </w:r>
-            <w:proofErr w:type="spellEnd"/>
-            <w:r>
-              <w:rPr>
-                <w:rFonts w:ascii="Times" w:eastAsia="Times" w:hAnsi="Times" w:cs="Times"/>
-                <w:lang w:eastAsia="zh-TW"/>
-              </w:rPr>
-              <w:t xml:space="preserve"> D 8</w:t>
-            </w:r>
-            <w:r>
-              <w:rPr>
-                <w:rFonts w:ascii="Times" w:eastAsia="Times" w:hAnsi="Times" w:cs="Times"/>
+                <w:rFonts w:ascii="Times" w:hAnsi="Times" w:cs="Times"/>
+              </w:rPr>
+            </w:pPr>
+            <w:r>
+              <w:rPr>
+                <w:rFonts w:ascii="Times" w:hAnsi="Times" w:cs="Times"/>
+                <w:lang w:eastAsia="zh-TW"/>
+              </w:rPr>
+              <w:t>Edited sul D 8</w:t>
+            </w:r>
+            <w:r>
+              <w:rPr>
+                <w:rFonts w:ascii="Times" w:hAnsi="Times" w:cs="Times"/>
                 <w:vertAlign w:val="superscript"/>
                 <w:lang w:eastAsia="zh-TW"/>
               </w:rPr>
@@ -2186,14 +2438,14 @@
             </w:r>
             <w:r>
               <w:rPr>
-                <w:rFonts w:ascii="Times" w:eastAsia="Times" w:hAnsi="Times" w:cs="Times"/>
+                <w:rFonts w:ascii="Times" w:hAnsi="Times" w:cs="Times"/>
                 <w:lang w:eastAsia="zh-TW"/>
               </w:rPr>
               <w:t xml:space="preserve"> partial to 6</w:t>
             </w:r>
             <w:r>
               <w:rPr>
-                <w:rFonts w:ascii="Times" w:eastAsia="Times" w:hAnsi="Times" w:cs="Times"/>
+                <w:rFonts w:ascii="Times" w:hAnsi="Times" w:cs="Times"/>
                 <w:vertAlign w:val="superscript"/>
                 <w:lang w:eastAsia="zh-TW"/>
               </w:rPr>
@@ -2201,26 +2453,60 @@
             </w:r>
             <w:r>
               <w:rPr>
-                <w:rFonts w:ascii="Times" w:eastAsia="Times" w:hAnsi="Times" w:cs="Times"/>
-                <w:lang w:eastAsia="zh-TW"/>
-              </w:rPr>
-              <w:t xml:space="preserve"> partial on </w:t>
-            </w:r>
-            <w:proofErr w:type="spellStart"/>
-            <w:r>
-              <w:rPr>
-                <w:rFonts w:ascii="Times" w:eastAsia="Times" w:hAnsi="Times" w:cs="Times"/>
-                <w:lang w:eastAsia="zh-TW"/>
-              </w:rPr>
-              <w:t>sul</w:t>
-            </w:r>
-            <w:proofErr w:type="spellEnd"/>
-            <w:r>
-              <w:rPr>
-                <w:rFonts w:ascii="Times" w:eastAsia="Times" w:hAnsi="Times" w:cs="Times"/>
-                <w:lang w:eastAsia="zh-TW"/>
-              </w:rPr>
-              <w:t xml:space="preserve"> G</w:t>
+                <w:rFonts w:ascii="Times" w:hAnsi="Times" w:cs="Times"/>
+                <w:lang w:eastAsia="zh-TW"/>
+              </w:rPr>
+              <w:t xml:space="preserve"> partial on sul G</w:t>
+            </w:r>
+          </w:p>
+          <w:p>
+            <w:pPr>
+              <w:rPr>
+                <w:rFonts w:ascii="Times" w:hAnsi="Times" w:cs="Times" w:hint="eastAsia"/>
+                <w:lang w:eastAsia="zh-TW"/>
+              </w:rPr>
+            </w:pPr>
+            <w:r>
+              <w:rPr>
+                <w:rFonts w:ascii="Times" w:hAnsi="Times" w:cs="Times" w:hint="eastAsia"/>
+                <w:lang w:eastAsia="zh-TW"/>
+              </w:rPr>
+              <w:t>8</w:t>
+            </w:r>
+            <w:r>
+              <w:rPr>
+                <w:rFonts w:ascii="Times" w:hAnsi="Times" w:cs="Times" w:hint="eastAsia"/>
+                <w:lang w:eastAsia="zh-TW"/>
+              </w:rPr>
+              <w:t>次諧波分音</w:t>
+            </w:r>
+            <w:r>
+              <w:rPr>
+                <w:rFonts w:ascii="Times" w:hAnsi="Times" w:cs="Times" w:hint="eastAsia"/>
+                <w:lang w:eastAsia="zh-TW"/>
+              </w:rPr>
+              <w:t>改爲</w:t>
+            </w:r>
+            <w:r>
+              <w:rPr>
+                <w:rFonts w:ascii="Times" w:hAnsi="Times" w:cs="Times"/>
+                <w:lang w:eastAsia="zh-TW"/>
+              </w:rPr>
+              <w:t>6</w:t>
+            </w:r>
+            <w:r>
+              <w:rPr>
+                <w:rFonts w:ascii="Times" w:hAnsi="Times" w:cs="Times"/>
+                <w:lang w:eastAsia="zh-TW"/>
+              </w:rPr>
+              <w:t>次諧波</w:t>
+            </w:r>
+            <w:r>
+              <w:rPr>
+                <w:rFonts w:ascii="Times" w:hAnsi="Times" w:cs="Times" w:hint="eastAsia"/>
+                <w:lang w:eastAsia="zh-TW"/>
+              </w:rPr>
+              <w:t>。</w:t>
             </w:r>
           </w:p>
         </w:tc>
@@ -2253,13 +2539,13 @@
             <w:pPr>
               <w:jc w:val="center"/>
               <w:rPr>
-                <w:rFonts w:ascii="Times" w:eastAsia="Times" w:hAnsi="Times" w:cs="Times"/>
-                <w:lang w:eastAsia="zh-TW"/>
-              </w:rPr>
-            </w:pPr>
-            <w:r>
-              <w:rPr>
-                <w:rFonts w:ascii="Times" w:eastAsia="Times" w:hAnsi="Times" w:cs="Times"/>
+                <w:rFonts w:ascii="Times" w:hAnsi="Times" w:cs="Times"/>
+                <w:lang w:eastAsia="zh-TW"/>
+              </w:rPr>
+            </w:pPr>
+            <w:r>
+              <w:rPr>
+                <w:rFonts w:ascii="Times" w:hAnsi="Times" w:cs="Times"/>
                 <w:lang w:eastAsia="zh-TW"/>
               </w:rPr>
               <w:t>293</w:t>
@@ -2274,13 +2560,13 @@
             <w:pPr>
               <w:jc w:val="center"/>
               <w:rPr>
-                <w:rFonts w:ascii="Times" w:eastAsia="Times" w:hAnsi="Times" w:cs="Times"/>
-                <w:lang w:eastAsia="zh-TW"/>
-              </w:rPr>
-            </w:pPr>
-            <w:r>
-              <w:rPr>
-                <w:rFonts w:ascii="Times" w:eastAsia="Times" w:hAnsi="Times" w:cs="Times"/>
+                <w:rFonts w:ascii="Times" w:hAnsi="Times" w:cs="Times"/>
+                <w:lang w:eastAsia="zh-TW"/>
+              </w:rPr>
+            </w:pPr>
+            <w:r>
+              <w:rPr>
+                <w:rFonts w:ascii="Times" w:hAnsi="Times" w:cs="Times"/>
                 <w:lang w:eastAsia="zh-TW"/>
               </w:rPr>
               <w:t xml:space="preserve">GH, EH, ZH, </w:t>
@@ -2288,7 +2574,7 @@
             <w:proofErr w:type="spellStart"/>
             <w:r>
               <w:rPr>
-                <w:rFonts w:ascii="Times" w:eastAsia="Times" w:hAnsi="Times" w:cs="Times"/>
+                <w:rFonts w:ascii="Times" w:hAnsi="Times" w:cs="Times"/>
                 <w:lang w:eastAsia="zh-TW"/>
               </w:rPr>
               <w:t>Vc</w:t>
@@ -2296,7 +2582,7 @@
             <w:proofErr w:type="spellEnd"/>
             <w:r>
               <w:rPr>
-                <w:rFonts w:ascii="Times" w:eastAsia="Times" w:hAnsi="Times" w:cs="Times"/>
+                <w:rFonts w:ascii="Times" w:hAnsi="Times" w:cs="Times"/>
                 <w:lang w:eastAsia="zh-TW"/>
               </w:rPr>
               <w:t xml:space="preserve">, </w:t>
@@ -2304,7 +2590,7 @@
             <w:proofErr w:type="spellStart"/>
             <w:r>
               <w:rPr>
-                <w:rFonts w:ascii="Times" w:eastAsia="Times" w:hAnsi="Times" w:cs="Times"/>
+                <w:rFonts w:ascii="Times" w:hAnsi="Times" w:cs="Times"/>
                 <w:lang w:eastAsia="zh-TW"/>
               </w:rPr>
               <w:t>Cb</w:t>
@@ -2319,17 +2605,490 @@
           <w:p>
             <w:pPr>
               <w:rPr>
-                <w:rFonts w:ascii="Times" w:eastAsia="Times" w:hAnsi="Times" w:cs="Times"/>
-                <w:lang w:eastAsia="zh-TW"/>
-              </w:rPr>
-            </w:pPr>
-            <w:r>
-              <w:rPr>
-                <w:rFonts w:ascii="Times" w:eastAsia="Times" w:hAnsi="Times" w:cs="Times"/>
+                <w:rFonts w:ascii="Times" w:hAnsi="Times" w:cs="Times"/>
+              </w:rPr>
+            </w:pPr>
+            <w:r>
+              <w:rPr>
+                <w:rFonts w:ascii="Times" w:hAnsi="Times" w:cs="Times"/>
                 <w:lang w:eastAsia="zh-TW"/>
               </w:rPr>
               <w:t>Simplified harmonics to save space and reduce ledger lines.</w:t>
             </w:r>
+          </w:p>
+          <w:p>
+            <w:pPr>
+              <w:rPr>
+                <w:rFonts w:ascii="Times" w:hAnsi="Times" w:cs="Times" w:hint="eastAsia"/>
+                <w:lang w:eastAsia="zh-TW"/>
+              </w:rPr>
+            </w:pPr>
+            <w:proofErr w:type="gramStart"/>
+            <w:r>
+              <w:rPr>
+                <w:rFonts w:ascii="Times" w:hAnsi="Times" w:cs="Times"/>
+                <w:lang w:eastAsia="zh-TW"/>
+              </w:rPr>
+              <w:t>諧</w:t>
+            </w:r>
+            <w:proofErr w:type="gramEnd"/>
+            <w:r>
+              <w:rPr>
+                <w:rFonts w:ascii="Times" w:hAnsi="Times" w:cs="Times"/>
+                <w:lang w:eastAsia="zh-TW"/>
+              </w:rPr>
+              <w:t>波已簡化。這樣可以節省空間並減少</w:t>
+            </w:r>
+            <w:proofErr w:type="gramStart"/>
+            <w:r>
+              <w:rPr>
+                <w:rFonts w:ascii="Times" w:hAnsi="Times" w:cs="Times"/>
+                <w:lang w:eastAsia="zh-TW"/>
+              </w:rPr>
+              <w:t>帳本</w:t>
+            </w:r>
+            <w:proofErr w:type="gramEnd"/>
+            <w:r>
+              <w:rPr>
+                <w:rFonts w:ascii="Times" w:hAnsi="Times" w:cs="Times"/>
+                <w:lang w:eastAsia="zh-TW"/>
+              </w:rPr>
+              <w:t>線。</w:t>
+            </w:r>
+          </w:p>
+        </w:tc>
+        <w:tc>
+          <w:tcPr>
+            <w:tcW w:w="2994" w:type="dxa"/>
+            <w:vAlign w:val="center"/>
+          </w:tcPr>
+          <w:p>
+            <w:pPr>
+              <w:jc w:val="center"/>
+              <w:rPr>
+                <w:rFonts w:ascii="Times New Roman" w:hAnsi="Times New Roman" w:cs="Times New Roman"/>
+                <w:color w:val="FF0000"/>
+                <w:lang w:eastAsia="zh-TW"/>
+              </w:rPr>
+            </w:pPr>
+          </w:p>
+        </w:tc>
+      </w:tr>
+      <w:tr>
+        <w:trPr>
+          <w:trHeight w:val="552"/>
+        </w:trPr>
+        <w:tc>
+          <w:tcPr>
+            <w:tcW w:w="1129" w:type="dxa"/>
+          </w:tcPr>
+          <w:p>
+            <w:pPr>
+              <w:jc w:val="center"/>
+              <w:rPr>
+                <w:rFonts w:ascii="Times" w:hAnsi="Times" w:cs="Times"/>
+                <w:lang w:eastAsia="zh-TW"/>
+              </w:rPr>
+            </w:pPr>
+          </w:p>
+        </w:tc>
+        <w:tc>
+          <w:tcPr>
+            <w:tcW w:w="1985" w:type="dxa"/>
+          </w:tcPr>
+          <w:p>
+            <w:pPr>
+              <w:jc w:val="center"/>
+              <w:rPr>
+                <w:rFonts w:ascii="Times" w:hAnsi="Times" w:cs="Times"/>
+                <w:lang w:eastAsia="zh-TW"/>
+              </w:rPr>
+            </w:pPr>
+          </w:p>
+        </w:tc>
+        <w:tc>
+          <w:tcPr>
+            <w:tcW w:w="2977" w:type="dxa"/>
+          </w:tcPr>
+          <w:p>
+            <w:pPr>
+              <w:rPr>
+                <w:rFonts w:ascii="Times" w:hAnsi="Times" w:cs="Times"/>
+                <w:lang w:eastAsia="zh-TW"/>
+              </w:rPr>
+            </w:pPr>
+          </w:p>
+        </w:tc>
+        <w:tc>
+          <w:tcPr>
+            <w:tcW w:w="2994" w:type="dxa"/>
+            <w:vAlign w:val="center"/>
+          </w:tcPr>
+          <w:p>
+            <w:pPr>
+              <w:jc w:val="center"/>
+              <w:rPr>
+                <w:rFonts w:ascii="Times New Roman" w:hAnsi="Times New Roman" w:cs="Times New Roman"/>
+                <w:color w:val="FF0000"/>
+                <w:lang w:eastAsia="zh-TW"/>
+              </w:rPr>
+            </w:pPr>
+          </w:p>
+        </w:tc>
+      </w:tr>
+      <w:tr>
+        <w:trPr>
+          <w:trHeight w:val="552"/>
+        </w:trPr>
+        <w:tc>
+          <w:tcPr>
+            <w:tcW w:w="1129" w:type="dxa"/>
+          </w:tcPr>
+          <w:p>
+            <w:pPr>
+              <w:jc w:val="center"/>
+              <w:rPr>
+                <w:rFonts w:ascii="Times" w:hAnsi="Times" w:cs="Times"/>
+                <w:lang w:eastAsia="zh-TW"/>
+              </w:rPr>
+            </w:pPr>
+          </w:p>
+        </w:tc>
+        <w:tc>
+          <w:tcPr>
+            <w:tcW w:w="1985" w:type="dxa"/>
+          </w:tcPr>
+          <w:p>
+            <w:pPr>
+              <w:jc w:val="center"/>
+              <w:rPr>
+                <w:rFonts w:ascii="Times" w:hAnsi="Times" w:cs="Times"/>
+                <w:lang w:eastAsia="zh-TW"/>
+              </w:rPr>
+            </w:pPr>
+          </w:p>
+        </w:tc>
+        <w:tc>
+          <w:tcPr>
+            <w:tcW w:w="2977" w:type="dxa"/>
+          </w:tcPr>
+          <w:p>
+            <w:pPr>
+              <w:rPr>
+                <w:rFonts w:ascii="Times" w:hAnsi="Times" w:cs="Times"/>
+                <w:lang w:eastAsia="zh-TW"/>
+              </w:rPr>
+            </w:pPr>
+          </w:p>
+        </w:tc>
+        <w:tc>
+          <w:tcPr>
+            <w:tcW w:w="2994" w:type="dxa"/>
+            <w:vAlign w:val="center"/>
+          </w:tcPr>
+          <w:p>
+            <w:pPr>
+              <w:jc w:val="center"/>
+              <w:rPr>
+                <w:rFonts w:ascii="Times New Roman" w:hAnsi="Times New Roman" w:cs="Times New Roman"/>
+                <w:color w:val="FF0000"/>
+                <w:lang w:eastAsia="zh-TW"/>
+              </w:rPr>
+            </w:pPr>
+          </w:p>
+        </w:tc>
+      </w:tr>
+      <w:tr>
+        <w:trPr>
+          <w:trHeight w:val="552"/>
+        </w:trPr>
+        <w:tc>
+          <w:tcPr>
+            <w:tcW w:w="1129" w:type="dxa"/>
+          </w:tcPr>
+          <w:p>
+            <w:pPr>
+              <w:jc w:val="center"/>
+              <w:rPr>
+                <w:rFonts w:ascii="Times" w:hAnsi="Times" w:cs="Times"/>
+                <w:lang w:eastAsia="zh-TW"/>
+              </w:rPr>
+            </w:pPr>
+          </w:p>
+        </w:tc>
+        <w:tc>
+          <w:tcPr>
+            <w:tcW w:w="1985" w:type="dxa"/>
+          </w:tcPr>
+          <w:p>
+            <w:pPr>
+              <w:jc w:val="center"/>
+              <w:rPr>
+                <w:rFonts w:ascii="Times" w:hAnsi="Times" w:cs="Times"/>
+                <w:lang w:eastAsia="zh-TW"/>
+              </w:rPr>
+            </w:pPr>
+          </w:p>
+        </w:tc>
+        <w:tc>
+          <w:tcPr>
+            <w:tcW w:w="2977" w:type="dxa"/>
+          </w:tcPr>
+          <w:p>
+            <w:pPr>
+              <w:rPr>
+                <w:rFonts w:ascii="Times" w:hAnsi="Times" w:cs="Times"/>
+                <w:lang w:eastAsia="zh-TW"/>
+              </w:rPr>
+            </w:pPr>
+          </w:p>
+        </w:tc>
+        <w:tc>
+          <w:tcPr>
+            <w:tcW w:w="2994" w:type="dxa"/>
+            <w:vAlign w:val="center"/>
+          </w:tcPr>
+          <w:p>
+            <w:pPr>
+              <w:jc w:val="center"/>
+              <w:rPr>
+                <w:rFonts w:ascii="Times New Roman" w:hAnsi="Times New Roman" w:cs="Times New Roman"/>
+                <w:color w:val="FF0000"/>
+                <w:lang w:eastAsia="zh-TW"/>
+              </w:rPr>
+            </w:pPr>
+          </w:p>
+        </w:tc>
+      </w:tr>
+      <w:tr>
+        <w:trPr>
+          <w:trHeight w:val="552"/>
+        </w:trPr>
+        <w:tc>
+          <w:tcPr>
+            <w:tcW w:w="1129" w:type="dxa"/>
+          </w:tcPr>
+          <w:p>
+            <w:pPr>
+              <w:jc w:val="center"/>
+              <w:rPr>
+                <w:rFonts w:ascii="Times" w:hAnsi="Times" w:cs="Times"/>
+                <w:lang w:eastAsia="zh-TW"/>
+              </w:rPr>
+            </w:pPr>
+          </w:p>
+        </w:tc>
+        <w:tc>
+          <w:tcPr>
+            <w:tcW w:w="1985" w:type="dxa"/>
+          </w:tcPr>
+          <w:p>
+            <w:pPr>
+              <w:jc w:val="center"/>
+              <w:rPr>
+                <w:rFonts w:ascii="Times" w:hAnsi="Times" w:cs="Times"/>
+                <w:lang w:eastAsia="zh-TW"/>
+              </w:rPr>
+            </w:pPr>
+          </w:p>
+        </w:tc>
+        <w:tc>
+          <w:tcPr>
+            <w:tcW w:w="2977" w:type="dxa"/>
+          </w:tcPr>
+          <w:p>
+            <w:pPr>
+              <w:rPr>
+                <w:rFonts w:ascii="Times" w:hAnsi="Times" w:cs="Times"/>
+                <w:lang w:eastAsia="zh-TW"/>
+              </w:rPr>
+            </w:pPr>
+          </w:p>
+        </w:tc>
+        <w:tc>
+          <w:tcPr>
+            <w:tcW w:w="2994" w:type="dxa"/>
+            <w:vAlign w:val="center"/>
+          </w:tcPr>
+          <w:p>
+            <w:pPr>
+              <w:jc w:val="center"/>
+              <w:rPr>
+                <w:rFonts w:ascii="Times New Roman" w:hAnsi="Times New Roman" w:cs="Times New Roman"/>
+                <w:color w:val="FF0000"/>
+                <w:lang w:eastAsia="zh-TW"/>
+              </w:rPr>
+            </w:pPr>
+          </w:p>
+        </w:tc>
+      </w:tr>
+      <w:tr>
+        <w:trPr>
+          <w:trHeight w:val="552"/>
+        </w:trPr>
+        <w:tc>
+          <w:tcPr>
+            <w:tcW w:w="1129" w:type="dxa"/>
+          </w:tcPr>
+          <w:p>
+            <w:pPr>
+              <w:jc w:val="center"/>
+              <w:rPr>
+                <w:rFonts w:ascii="Times" w:hAnsi="Times" w:cs="Times"/>
+                <w:lang w:eastAsia="zh-TW"/>
+              </w:rPr>
+            </w:pPr>
+          </w:p>
+        </w:tc>
+        <w:tc>
+          <w:tcPr>
+            <w:tcW w:w="1985" w:type="dxa"/>
+          </w:tcPr>
+          <w:p>
+            <w:pPr>
+              <w:jc w:val="center"/>
+              <w:rPr>
+                <w:rFonts w:ascii="MS Mincho" w:hAnsi="MS Mincho" w:cs="MS Mincho"/>
+                <w:lang w:val="en-US" w:eastAsia="zh-TW"/>
+              </w:rPr>
+            </w:pPr>
+          </w:p>
+        </w:tc>
+        <w:tc>
+          <w:tcPr>
+            <w:tcW w:w="2977" w:type="dxa"/>
+          </w:tcPr>
+          <w:p>
+            <w:pPr>
+              <w:rPr>
+                <w:rFonts w:ascii="Times" w:hAnsi="Times" w:cs="Times"/>
+                <w:lang w:eastAsia="zh-TW"/>
+              </w:rPr>
+            </w:pPr>
+          </w:p>
+        </w:tc>
+        <w:tc>
+          <w:tcPr>
+            <w:tcW w:w="2994" w:type="dxa"/>
+            <w:vAlign w:val="center"/>
+          </w:tcPr>
+          <w:p>
+            <w:pPr>
+              <w:jc w:val="center"/>
+              <w:rPr>
+                <w:rFonts w:ascii="Times New Roman" w:hAnsi="Times New Roman" w:cs="Times New Roman"/>
+                <w:color w:val="FF0000"/>
+                <w:lang w:eastAsia="zh-TW"/>
+              </w:rPr>
+            </w:pPr>
+          </w:p>
+        </w:tc>
+      </w:tr>
+      <w:tr>
+        <w:trPr>
+          <w:trHeight w:val="552"/>
+        </w:trPr>
+        <w:tc>
+          <w:tcPr>
+            <w:tcW w:w="1129" w:type="dxa"/>
+          </w:tcPr>
+          <w:p>
+            <w:pPr>
+              <w:jc w:val="center"/>
+              <w:rPr>
+                <w:rFonts w:ascii="Times" w:hAnsi="Times" w:cs="Times"/>
+                <w:lang w:eastAsia="zh-TW"/>
+              </w:rPr>
+            </w:pPr>
+          </w:p>
+        </w:tc>
+        <w:tc>
+          <w:tcPr>
+            <w:tcW w:w="1985" w:type="dxa"/>
+          </w:tcPr>
+          <w:p>
+            <w:pPr>
+              <w:jc w:val="center"/>
+              <w:rPr>
+                <w:rFonts w:ascii="Times" w:hAnsi="Times" w:cs="Times"/>
+                <w:lang w:eastAsia="zh-TW"/>
+              </w:rPr>
+            </w:pPr>
+          </w:p>
+        </w:tc>
+        <w:tc>
+          <w:tcPr>
+            <w:tcW w:w="2977" w:type="dxa"/>
+          </w:tcPr>
+          <w:p>
+            <w:pPr>
+              <w:rPr>
+                <w:rFonts w:ascii="Times" w:hAnsi="Times" w:cs="Times"/>
+                <w:lang w:eastAsia="zh-TW"/>
+              </w:rPr>
+            </w:pPr>
+          </w:p>
+        </w:tc>
+        <w:tc>
+          <w:tcPr>
+            <w:tcW w:w="2994" w:type="dxa"/>
+            <w:vAlign w:val="center"/>
+          </w:tcPr>
+          <w:p>
+            <w:pPr>
+              <w:jc w:val="center"/>
+              <w:rPr>
+                <w:rFonts w:ascii="Times New Roman" w:hAnsi="Times New Roman" w:cs="Times New Roman"/>
+                <w:color w:val="FF0000"/>
+                <w:lang w:eastAsia="zh-TW"/>
+              </w:rPr>
+            </w:pPr>
+          </w:p>
+        </w:tc>
+      </w:tr>
+      <w:tr>
+        <w:trPr>
+          <w:trHeight w:val="552"/>
+        </w:trPr>
+        <w:tc>
+          <w:tcPr>
+            <w:tcW w:w="1129" w:type="dxa"/>
+          </w:tcPr>
+          <w:p>
+            <w:pPr>
+              <w:jc w:val="center"/>
+              <w:rPr>
+                <w:rFonts w:ascii="Times" w:hAnsi="Times" w:cs="Times"/>
+                <w:lang w:eastAsia="zh-TW"/>
+              </w:rPr>
+            </w:pPr>
+          </w:p>
+        </w:tc>
+        <w:tc>
+          <w:tcPr>
+            <w:tcW w:w="1985" w:type="dxa"/>
+          </w:tcPr>
+          <w:p>
+            <w:pPr>
+              <w:jc w:val="center"/>
+              <w:rPr>
+                <w:rFonts w:ascii="MS Mincho" w:hAnsi="MS Mincho" w:cs="MS Mincho"/>
+                <w:lang w:val="en-US" w:eastAsia="zh-TW"/>
+              </w:rPr>
+            </w:pPr>
+          </w:p>
+        </w:tc>
+        <w:tc>
+          <w:tcPr>
+            <w:tcW w:w="2977" w:type="dxa"/>
+          </w:tcPr>
+          <w:p>
+            <w:pPr>
+              <w:rPr>
+                <w:rFonts w:ascii="Times" w:hAnsi="Times" w:cs="Times"/>
+                <w:lang w:eastAsia="zh-TW"/>
+              </w:rPr>
+            </w:pPr>
           </w:p>
         </w:tc>
         <w:tc>
@@ -2431,7 +3190,7 @@
     <w:p>
       <w:pPr>
         <w:rPr>
-          <w:rFonts w:ascii="Times" w:eastAsia="Times" w:hAnsi="Times" w:cs="Times"/>
+          <w:rFonts w:ascii="Times" w:hAnsi="Times" w:cs="Times"/>
           <w:bCs/>
           <w:lang w:eastAsia="zh-TW"/>
         </w:rPr>
@@ -3624,7 +4383,6 @@
   <w:style w:type="character" w:default="1" w:styleId="DefaultParagraphFont">
     <w:name w:val="Default Paragraph Font"/>
     <w:uiPriority w:val="1"/>
-    <w:semiHidden/>
     <w:unhideWhenUsed/>
   </w:style>
   <w:style w:type="table" w:default="1" w:styleId="TableNormal">

</xml_diff>